<commit_message>
Update persona design and whitepaper docs
Co-Authored-By: Claude Opus 4.6 (1M context) <noreply@anthropic.com>
</commit_message>
<xml_diff>
--- a/brand/docs/Aria_Cole_Persona_Design.docx
+++ b/brand/docs/Aria_Cole_Persona_Design.docx
@@ -287,6 +287,7 @@
               <w:bottom w:val="single" w:color="DDDDDD" w:sz="1"/>
               <w:right w:val="single" w:color="DDDDDD" w:sz="1"/>
             </w:tcBorders>
+            <w:shd w:fill="FFFFFF" w:val="clear"/>
             <w:tcMar>
               <w:top w:type="dxa" w:w="80"/>
               <w:left w:type="dxa" w:w="120"/>
@@ -315,6 +316,7 @@
               <w:bottom w:val="single" w:color="DDDDDD" w:sz="1"/>
               <w:right w:val="single" w:color="DDDDDD" w:sz="1"/>
             </w:tcBorders>
+            <w:shd w:fill="FFFFFF" w:val="clear"/>
             <w:tcMar>
               <w:top w:type="dxa" w:w="80"/>
               <w:left w:type="dxa" w:w="120"/>
@@ -343,6 +345,7 @@
               <w:bottom w:val="single" w:color="DDDDDD" w:sz="1"/>
               <w:right w:val="single" w:color="DDDDDD" w:sz="1"/>
             </w:tcBorders>
+            <w:shd w:fill="FFFFFF" w:val="clear"/>
             <w:tcMar>
               <w:top w:type="dxa" w:w="80"/>
               <w:left w:type="dxa" w:w="120"/>
@@ -373,6 +376,7 @@
               <w:bottom w:val="single" w:color="DDDDDD" w:sz="1"/>
               <w:right w:val="single" w:color="DDDDDD" w:sz="1"/>
             </w:tcBorders>
+            <w:shd w:fill="F0F0F5" w:val="clear"/>
             <w:tcMar>
               <w:top w:type="dxa" w:w="80"/>
               <w:left w:type="dxa" w:w="120"/>
@@ -401,6 +405,7 @@
               <w:bottom w:val="single" w:color="DDDDDD" w:sz="1"/>
               <w:right w:val="single" w:color="DDDDDD" w:sz="1"/>
             </w:tcBorders>
+            <w:shd w:fill="F0F0F5" w:val="clear"/>
             <w:tcMar>
               <w:top w:type="dxa" w:w="80"/>
               <w:left w:type="dxa" w:w="120"/>
@@ -429,6 +434,7 @@
               <w:bottom w:val="single" w:color="DDDDDD" w:sz="1"/>
               <w:right w:val="single" w:color="DDDDDD" w:sz="1"/>
             </w:tcBorders>
+            <w:shd w:fill="F0F0F5" w:val="clear"/>
             <w:tcMar>
               <w:top w:type="dxa" w:w="80"/>
               <w:left w:type="dxa" w:w="120"/>
@@ -459,6 +465,7 @@
               <w:bottom w:val="single" w:color="DDDDDD" w:sz="1"/>
               <w:right w:val="single" w:color="DDDDDD" w:sz="1"/>
             </w:tcBorders>
+            <w:shd w:fill="FFFFFF" w:val="clear"/>
             <w:tcMar>
               <w:top w:type="dxa" w:w="80"/>
               <w:left w:type="dxa" w:w="120"/>
@@ -487,6 +494,7 @@
               <w:bottom w:val="single" w:color="DDDDDD" w:sz="1"/>
               <w:right w:val="single" w:color="DDDDDD" w:sz="1"/>
             </w:tcBorders>
+            <w:shd w:fill="FFFFFF" w:val="clear"/>
             <w:tcMar>
               <w:top w:type="dxa" w:w="80"/>
               <w:left w:type="dxa" w:w="120"/>
@@ -515,6 +523,7 @@
               <w:bottom w:val="single" w:color="DDDDDD" w:sz="1"/>
               <w:right w:val="single" w:color="DDDDDD" w:sz="1"/>
             </w:tcBorders>
+            <w:shd w:fill="FFFFFF" w:val="clear"/>
             <w:tcMar>
               <w:top w:type="dxa" w:w="80"/>
               <w:left w:type="dxa" w:w="120"/>
@@ -545,6 +554,7 @@
               <w:bottom w:val="single" w:color="DDDDDD" w:sz="1"/>
               <w:right w:val="single" w:color="DDDDDD" w:sz="1"/>
             </w:tcBorders>
+            <w:shd w:fill="F0F0F5" w:val="clear"/>
             <w:tcMar>
               <w:top w:type="dxa" w:w="80"/>
               <w:left w:type="dxa" w:w="120"/>
@@ -573,6 +583,7 @@
               <w:bottom w:val="single" w:color="DDDDDD" w:sz="1"/>
               <w:right w:val="single" w:color="DDDDDD" w:sz="1"/>
             </w:tcBorders>
+            <w:shd w:fill="F0F0F5" w:val="clear"/>
             <w:tcMar>
               <w:top w:type="dxa" w:w="80"/>
               <w:left w:type="dxa" w:w="120"/>
@@ -601,6 +612,7 @@
               <w:bottom w:val="single" w:color="DDDDDD" w:sz="1"/>
               <w:right w:val="single" w:color="DDDDDD" w:sz="1"/>
             </w:tcBorders>
+            <w:shd w:fill="F0F0F5" w:val="clear"/>
             <w:tcMar>
               <w:top w:type="dxa" w:w="80"/>
               <w:left w:type="dxa" w:w="120"/>
@@ -631,6 +643,7 @@
               <w:bottom w:val="single" w:color="DDDDDD" w:sz="1"/>
               <w:right w:val="single" w:color="DDDDDD" w:sz="1"/>
             </w:tcBorders>
+            <w:shd w:fill="FFFFFF" w:val="clear"/>
             <w:tcMar>
               <w:top w:type="dxa" w:w="80"/>
               <w:left w:type="dxa" w:w="120"/>
@@ -659,6 +672,7 @@
               <w:bottom w:val="single" w:color="DDDDDD" w:sz="1"/>
               <w:right w:val="single" w:color="DDDDDD" w:sz="1"/>
             </w:tcBorders>
+            <w:shd w:fill="FFFFFF" w:val="clear"/>
             <w:tcMar>
               <w:top w:type="dxa" w:w="80"/>
               <w:left w:type="dxa" w:w="120"/>
@@ -687,6 +701,7 @@
               <w:bottom w:val="single" w:color="DDDDDD" w:sz="1"/>
               <w:right w:val="single" w:color="DDDDDD" w:sz="1"/>
             </w:tcBorders>
+            <w:shd w:fill="FFFFFF" w:val="clear"/>
             <w:tcMar>
               <w:top w:type="dxa" w:w="80"/>
               <w:left w:type="dxa" w:w="120"/>
@@ -923,6 +938,7 @@
               <w:bottom w:val="single" w:color="DDDDDD" w:sz="1"/>
               <w:right w:val="single" w:color="DDDDDD" w:sz="1"/>
             </w:tcBorders>
+            <w:shd w:fill="FFFFFF" w:val="clear"/>
             <w:tcMar>
               <w:top w:type="dxa" w:w="80"/>
               <w:left w:type="dxa" w:w="120"/>
@@ -951,6 +967,7 @@
               <w:bottom w:val="single" w:color="DDDDDD" w:sz="1"/>
               <w:right w:val="single" w:color="DDDDDD" w:sz="1"/>
             </w:tcBorders>
+            <w:shd w:fill="FFFFFF" w:val="clear"/>
             <w:tcMar>
               <w:top w:type="dxa" w:w="80"/>
               <w:left w:type="dxa" w:w="120"/>
@@ -981,6 +998,7 @@
               <w:bottom w:val="single" w:color="DDDDDD" w:sz="1"/>
               <w:right w:val="single" w:color="DDDDDD" w:sz="1"/>
             </w:tcBorders>
+            <w:shd w:fill="F0F0F5" w:val="clear"/>
             <w:tcMar>
               <w:top w:type="dxa" w:w="80"/>
               <w:left w:type="dxa" w:w="120"/>
@@ -1009,6 +1027,7 @@
               <w:bottom w:val="single" w:color="DDDDDD" w:sz="1"/>
               <w:right w:val="single" w:color="DDDDDD" w:sz="1"/>
             </w:tcBorders>
+            <w:shd w:fill="F0F0F5" w:val="clear"/>
             <w:tcMar>
               <w:top w:type="dxa" w:w="80"/>
               <w:left w:type="dxa" w:w="120"/>
@@ -1039,6 +1058,7 @@
               <w:bottom w:val="single" w:color="DDDDDD" w:sz="1"/>
               <w:right w:val="single" w:color="DDDDDD" w:sz="1"/>
             </w:tcBorders>
+            <w:shd w:fill="FFFFFF" w:val="clear"/>
             <w:tcMar>
               <w:top w:type="dxa" w:w="80"/>
               <w:left w:type="dxa" w:w="120"/>
@@ -1067,6 +1087,7 @@
               <w:bottom w:val="single" w:color="DDDDDD" w:sz="1"/>
               <w:right w:val="single" w:color="DDDDDD" w:sz="1"/>
             </w:tcBorders>
+            <w:shd w:fill="FFFFFF" w:val="clear"/>
             <w:tcMar>
               <w:top w:type="dxa" w:w="80"/>
               <w:left w:type="dxa" w:w="120"/>
@@ -1097,6 +1118,7 @@
               <w:bottom w:val="single" w:color="DDDDDD" w:sz="1"/>
               <w:right w:val="single" w:color="DDDDDD" w:sz="1"/>
             </w:tcBorders>
+            <w:shd w:fill="F0F0F5" w:val="clear"/>
             <w:tcMar>
               <w:top w:type="dxa" w:w="80"/>
               <w:left w:type="dxa" w:w="120"/>
@@ -1125,6 +1147,7 @@
               <w:bottom w:val="single" w:color="DDDDDD" w:sz="1"/>
               <w:right w:val="single" w:color="DDDDDD" w:sz="1"/>
             </w:tcBorders>
+            <w:shd w:fill="F0F0F5" w:val="clear"/>
             <w:tcMar>
               <w:top w:type="dxa" w:w="80"/>
               <w:left w:type="dxa" w:w="120"/>
@@ -1155,6 +1178,7 @@
               <w:bottom w:val="single" w:color="DDDDDD" w:sz="1"/>
               <w:right w:val="single" w:color="DDDDDD" w:sz="1"/>
             </w:tcBorders>
+            <w:shd w:fill="FFFFFF" w:val="clear"/>
             <w:tcMar>
               <w:top w:type="dxa" w:w="80"/>
               <w:left w:type="dxa" w:w="120"/>
@@ -1183,6 +1207,7 @@
               <w:bottom w:val="single" w:color="DDDDDD" w:sz="1"/>
               <w:right w:val="single" w:color="DDDDDD" w:sz="1"/>
             </w:tcBorders>
+            <w:shd w:fill="FFFFFF" w:val="clear"/>
             <w:tcMar>
               <w:top w:type="dxa" w:w="80"/>
               <w:left w:type="dxa" w:w="120"/>
@@ -1213,6 +1238,7 @@
               <w:bottom w:val="single" w:color="DDDDDD" w:sz="1"/>
               <w:right w:val="single" w:color="DDDDDD" w:sz="1"/>
             </w:tcBorders>
+            <w:shd w:fill="F0F0F5" w:val="clear"/>
             <w:tcMar>
               <w:top w:type="dxa" w:w="80"/>
               <w:left w:type="dxa" w:w="120"/>
@@ -1241,6 +1267,7 @@
               <w:bottom w:val="single" w:color="DDDDDD" w:sz="1"/>
               <w:right w:val="single" w:color="DDDDDD" w:sz="1"/>
             </w:tcBorders>
+            <w:shd w:fill="F0F0F5" w:val="clear"/>
             <w:tcMar>
               <w:top w:type="dxa" w:w="80"/>
               <w:left w:type="dxa" w:w="120"/>
@@ -1271,6 +1298,7 @@
               <w:bottom w:val="single" w:color="DDDDDD" w:sz="1"/>
               <w:right w:val="single" w:color="DDDDDD" w:sz="1"/>
             </w:tcBorders>
+            <w:shd w:fill="FFFFFF" w:val="clear"/>
             <w:tcMar>
               <w:top w:type="dxa" w:w="80"/>
               <w:left w:type="dxa" w:w="120"/>
@@ -1299,6 +1327,7 @@
               <w:bottom w:val="single" w:color="DDDDDD" w:sz="1"/>
               <w:right w:val="single" w:color="DDDDDD" w:sz="1"/>
             </w:tcBorders>
+            <w:shd w:fill="FFFFFF" w:val="clear"/>
             <w:tcMar>
               <w:top w:type="dxa" w:w="80"/>
               <w:left w:type="dxa" w:w="120"/>
@@ -1329,6 +1358,7 @@
               <w:bottom w:val="single" w:color="DDDDDD" w:sz="1"/>
               <w:right w:val="single" w:color="DDDDDD" w:sz="1"/>
             </w:tcBorders>
+            <w:shd w:fill="F0F0F5" w:val="clear"/>
             <w:tcMar>
               <w:top w:type="dxa" w:w="80"/>
               <w:left w:type="dxa" w:w="120"/>
@@ -1357,6 +1387,7 @@
               <w:bottom w:val="single" w:color="DDDDDD" w:sz="1"/>
               <w:right w:val="single" w:color="DDDDDD" w:sz="1"/>
             </w:tcBorders>
+            <w:shd w:fill="F0F0F5" w:val="clear"/>
             <w:tcMar>
               <w:top w:type="dxa" w:w="80"/>
               <w:left w:type="dxa" w:w="120"/>
@@ -1387,6 +1418,7 @@
               <w:bottom w:val="single" w:color="DDDDDD" w:sz="1"/>
               <w:right w:val="single" w:color="DDDDDD" w:sz="1"/>
             </w:tcBorders>
+            <w:shd w:fill="FFFFFF" w:val="clear"/>
             <w:tcMar>
               <w:top w:type="dxa" w:w="80"/>
               <w:left w:type="dxa" w:w="120"/>
@@ -1415,6 +1447,7 @@
               <w:bottom w:val="single" w:color="DDDDDD" w:sz="1"/>
               <w:right w:val="single" w:color="DDDDDD" w:sz="1"/>
             </w:tcBorders>
+            <w:shd w:fill="FFFFFF" w:val="clear"/>
             <w:tcMar>
               <w:top w:type="dxa" w:w="80"/>
               <w:left w:type="dxa" w:w="120"/>
@@ -1548,6 +1581,7 @@
               <w:bottom w:val="single" w:color="DDDDDD" w:sz="1"/>
               <w:right w:val="single" w:color="DDDDDD" w:sz="1"/>
             </w:tcBorders>
+            <w:shd w:fill="FFFFFF" w:val="clear"/>
             <w:tcMar>
               <w:top w:type="dxa" w:w="80"/>
               <w:left w:type="dxa" w:w="120"/>
@@ -1576,6 +1610,7 @@
               <w:bottom w:val="single" w:color="DDDDDD" w:sz="1"/>
               <w:right w:val="single" w:color="DDDDDD" w:sz="1"/>
             </w:tcBorders>
+            <w:shd w:fill="FFFFFF" w:val="clear"/>
             <w:tcMar>
               <w:top w:type="dxa" w:w="80"/>
               <w:left w:type="dxa" w:w="120"/>
@@ -1606,6 +1641,7 @@
               <w:bottom w:val="single" w:color="DDDDDD" w:sz="1"/>
               <w:right w:val="single" w:color="DDDDDD" w:sz="1"/>
             </w:tcBorders>
+            <w:shd w:fill="F0F0F5" w:val="clear"/>
             <w:tcMar>
               <w:top w:type="dxa" w:w="80"/>
               <w:left w:type="dxa" w:w="120"/>
@@ -1634,6 +1670,7 @@
               <w:bottom w:val="single" w:color="DDDDDD" w:sz="1"/>
               <w:right w:val="single" w:color="DDDDDD" w:sz="1"/>
             </w:tcBorders>
+            <w:shd w:fill="F0F0F5" w:val="clear"/>
             <w:tcMar>
               <w:top w:type="dxa" w:w="80"/>
               <w:left w:type="dxa" w:w="120"/>
@@ -1664,6 +1701,7 @@
               <w:bottom w:val="single" w:color="DDDDDD" w:sz="1"/>
               <w:right w:val="single" w:color="DDDDDD" w:sz="1"/>
             </w:tcBorders>
+            <w:shd w:fill="FFFFFF" w:val="clear"/>
             <w:tcMar>
               <w:top w:type="dxa" w:w="80"/>
               <w:left w:type="dxa" w:w="120"/>
@@ -1692,6 +1730,7 @@
               <w:bottom w:val="single" w:color="DDDDDD" w:sz="1"/>
               <w:right w:val="single" w:color="DDDDDD" w:sz="1"/>
             </w:tcBorders>
+            <w:shd w:fill="FFFFFF" w:val="clear"/>
             <w:tcMar>
               <w:top w:type="dxa" w:w="80"/>
               <w:left w:type="dxa" w:w="120"/>
@@ -1722,6 +1761,7 @@
               <w:bottom w:val="single" w:color="DDDDDD" w:sz="1"/>
               <w:right w:val="single" w:color="DDDDDD" w:sz="1"/>
             </w:tcBorders>
+            <w:shd w:fill="F0F0F5" w:val="clear"/>
             <w:tcMar>
               <w:top w:type="dxa" w:w="80"/>
               <w:left w:type="dxa" w:w="120"/>
@@ -1750,6 +1790,7 @@
               <w:bottom w:val="single" w:color="DDDDDD" w:sz="1"/>
               <w:right w:val="single" w:color="DDDDDD" w:sz="1"/>
             </w:tcBorders>
+            <w:shd w:fill="F0F0F5" w:val="clear"/>
             <w:tcMar>
               <w:top w:type="dxa" w:w="80"/>
               <w:left w:type="dxa" w:w="120"/>
@@ -1780,6 +1821,7 @@
               <w:bottom w:val="single" w:color="DDDDDD" w:sz="1"/>
               <w:right w:val="single" w:color="DDDDDD" w:sz="1"/>
             </w:tcBorders>
+            <w:shd w:fill="FFFFFF" w:val="clear"/>
             <w:tcMar>
               <w:top w:type="dxa" w:w="80"/>
               <w:left w:type="dxa" w:w="120"/>
@@ -1808,6 +1850,7 @@
               <w:bottom w:val="single" w:color="DDDDDD" w:sz="1"/>
               <w:right w:val="single" w:color="DDDDDD" w:sz="1"/>
             </w:tcBorders>
+            <w:shd w:fill="FFFFFF" w:val="clear"/>
             <w:tcMar>
               <w:top w:type="dxa" w:w="80"/>
               <w:left w:type="dxa" w:w="120"/>
@@ -1838,6 +1881,7 @@
               <w:bottom w:val="single" w:color="DDDDDD" w:sz="1"/>
               <w:right w:val="single" w:color="DDDDDD" w:sz="1"/>
             </w:tcBorders>
+            <w:shd w:fill="F0F0F5" w:val="clear"/>
             <w:tcMar>
               <w:top w:type="dxa" w:w="80"/>
               <w:left w:type="dxa" w:w="120"/>
@@ -1866,6 +1910,7 @@
               <w:bottom w:val="single" w:color="DDDDDD" w:sz="1"/>
               <w:right w:val="single" w:color="DDDDDD" w:sz="1"/>
             </w:tcBorders>
+            <w:shd w:fill="F0F0F5" w:val="clear"/>
             <w:tcMar>
               <w:top w:type="dxa" w:w="80"/>
               <w:left w:type="dxa" w:w="120"/>
@@ -1896,6 +1941,7 @@
               <w:bottom w:val="single" w:color="DDDDDD" w:sz="1"/>
               <w:right w:val="single" w:color="DDDDDD" w:sz="1"/>
             </w:tcBorders>
+            <w:shd w:fill="FFFFFF" w:val="clear"/>
             <w:tcMar>
               <w:top w:type="dxa" w:w="80"/>
               <w:left w:type="dxa" w:w="120"/>
@@ -1924,6 +1970,7 @@
               <w:bottom w:val="single" w:color="DDDDDD" w:sz="1"/>
               <w:right w:val="single" w:color="DDDDDD" w:sz="1"/>
             </w:tcBorders>
+            <w:shd w:fill="FFFFFF" w:val="clear"/>
             <w:tcMar>
               <w:top w:type="dxa" w:w="80"/>
               <w:left w:type="dxa" w:w="120"/>
@@ -1954,6 +2001,7 @@
               <w:bottom w:val="single" w:color="DDDDDD" w:sz="1"/>
               <w:right w:val="single" w:color="DDDDDD" w:sz="1"/>
             </w:tcBorders>
+            <w:shd w:fill="F0F0F5" w:val="clear"/>
             <w:tcMar>
               <w:top w:type="dxa" w:w="80"/>
               <w:left w:type="dxa" w:w="120"/>
@@ -1982,6 +2030,7 @@
               <w:bottom w:val="single" w:color="DDDDDD" w:sz="1"/>
               <w:right w:val="single" w:color="DDDDDD" w:sz="1"/>
             </w:tcBorders>
+            <w:shd w:fill="F0F0F5" w:val="clear"/>
             <w:tcMar>
               <w:top w:type="dxa" w:w="80"/>
               <w:left w:type="dxa" w:w="120"/>
@@ -2012,6 +2061,7 @@
               <w:bottom w:val="single" w:color="DDDDDD" w:sz="1"/>
               <w:right w:val="single" w:color="DDDDDD" w:sz="1"/>
             </w:tcBorders>
+            <w:shd w:fill="FFFFFF" w:val="clear"/>
             <w:tcMar>
               <w:top w:type="dxa" w:w="80"/>
               <w:left w:type="dxa" w:w="120"/>
@@ -2040,6 +2090,7 @@
               <w:bottom w:val="single" w:color="DDDDDD" w:sz="1"/>
               <w:right w:val="single" w:color="DDDDDD" w:sz="1"/>
             </w:tcBorders>
+            <w:shd w:fill="FFFFFF" w:val="clear"/>
             <w:tcMar>
               <w:top w:type="dxa" w:w="80"/>
               <w:left w:type="dxa" w:w="120"/>
@@ -2173,6 +2224,7 @@
               <w:bottom w:val="single" w:color="DDDDDD" w:sz="1"/>
               <w:right w:val="single" w:color="DDDDDD" w:sz="1"/>
             </w:tcBorders>
+            <w:shd w:fill="FFFFFF" w:val="clear"/>
             <w:tcMar>
               <w:top w:type="dxa" w:w="80"/>
               <w:left w:type="dxa" w:w="120"/>
@@ -2201,6 +2253,7 @@
               <w:bottom w:val="single" w:color="DDDDDD" w:sz="1"/>
               <w:right w:val="single" w:color="DDDDDD" w:sz="1"/>
             </w:tcBorders>
+            <w:shd w:fill="FFFFFF" w:val="clear"/>
             <w:tcMar>
               <w:top w:type="dxa" w:w="80"/>
               <w:left w:type="dxa" w:w="120"/>
@@ -2231,6 +2284,7 @@
               <w:bottom w:val="single" w:color="DDDDDD" w:sz="1"/>
               <w:right w:val="single" w:color="DDDDDD" w:sz="1"/>
             </w:tcBorders>
+            <w:shd w:fill="F0F0F5" w:val="clear"/>
             <w:tcMar>
               <w:top w:type="dxa" w:w="80"/>
               <w:left w:type="dxa" w:w="120"/>
@@ -2259,6 +2313,7 @@
               <w:bottom w:val="single" w:color="DDDDDD" w:sz="1"/>
               <w:right w:val="single" w:color="DDDDDD" w:sz="1"/>
             </w:tcBorders>
+            <w:shd w:fill="F0F0F5" w:val="clear"/>
             <w:tcMar>
               <w:top w:type="dxa" w:w="80"/>
               <w:left w:type="dxa" w:w="120"/>
@@ -2289,6 +2344,7 @@
               <w:bottom w:val="single" w:color="DDDDDD" w:sz="1"/>
               <w:right w:val="single" w:color="DDDDDD" w:sz="1"/>
             </w:tcBorders>
+            <w:shd w:fill="FFFFFF" w:val="clear"/>
             <w:tcMar>
               <w:top w:type="dxa" w:w="80"/>
               <w:left w:type="dxa" w:w="120"/>
@@ -2317,6 +2373,7 @@
               <w:bottom w:val="single" w:color="DDDDDD" w:sz="1"/>
               <w:right w:val="single" w:color="DDDDDD" w:sz="1"/>
             </w:tcBorders>
+            <w:shd w:fill="FFFFFF" w:val="clear"/>
             <w:tcMar>
               <w:top w:type="dxa" w:w="80"/>
               <w:left w:type="dxa" w:w="120"/>
@@ -2347,6 +2404,7 @@
               <w:bottom w:val="single" w:color="DDDDDD" w:sz="1"/>
               <w:right w:val="single" w:color="DDDDDD" w:sz="1"/>
             </w:tcBorders>
+            <w:shd w:fill="F0F0F5" w:val="clear"/>
             <w:tcMar>
               <w:top w:type="dxa" w:w="80"/>
               <w:left w:type="dxa" w:w="120"/>
@@ -2375,6 +2433,7 @@
               <w:bottom w:val="single" w:color="DDDDDD" w:sz="1"/>
               <w:right w:val="single" w:color="DDDDDD" w:sz="1"/>
             </w:tcBorders>
+            <w:shd w:fill="F0F0F5" w:val="clear"/>
             <w:tcMar>
               <w:top w:type="dxa" w:w="80"/>
               <w:left w:type="dxa" w:w="120"/>
@@ -2405,6 +2464,7 @@
               <w:bottom w:val="single" w:color="DDDDDD" w:sz="1"/>
               <w:right w:val="single" w:color="DDDDDD" w:sz="1"/>
             </w:tcBorders>
+            <w:shd w:fill="FFFFFF" w:val="clear"/>
             <w:tcMar>
               <w:top w:type="dxa" w:w="80"/>
               <w:left w:type="dxa" w:w="120"/>
@@ -2433,6 +2493,7 @@
               <w:bottom w:val="single" w:color="DDDDDD" w:sz="1"/>
               <w:right w:val="single" w:color="DDDDDD" w:sz="1"/>
             </w:tcBorders>
+            <w:shd w:fill="FFFFFF" w:val="clear"/>
             <w:tcMar>
               <w:top w:type="dxa" w:w="80"/>
               <w:left w:type="dxa" w:w="120"/>
@@ -2463,6 +2524,7 @@
               <w:bottom w:val="single" w:color="DDDDDD" w:sz="1"/>
               <w:right w:val="single" w:color="DDDDDD" w:sz="1"/>
             </w:tcBorders>
+            <w:shd w:fill="F0F0F5" w:val="clear"/>
             <w:tcMar>
               <w:top w:type="dxa" w:w="80"/>
               <w:left w:type="dxa" w:w="120"/>
@@ -2491,6 +2553,7 @@
               <w:bottom w:val="single" w:color="DDDDDD" w:sz="1"/>
               <w:right w:val="single" w:color="DDDDDD" w:sz="1"/>
             </w:tcBorders>
+            <w:shd w:fill="F0F0F5" w:val="clear"/>
             <w:tcMar>
               <w:top w:type="dxa" w:w="80"/>
               <w:left w:type="dxa" w:w="120"/>
@@ -2521,6 +2584,7 @@
               <w:bottom w:val="single" w:color="DDDDDD" w:sz="1"/>
               <w:right w:val="single" w:color="DDDDDD" w:sz="1"/>
             </w:tcBorders>
+            <w:shd w:fill="FFFFFF" w:val="clear"/>
             <w:tcMar>
               <w:top w:type="dxa" w:w="80"/>
               <w:left w:type="dxa" w:w="120"/>
@@ -2549,6 +2613,7 @@
               <w:bottom w:val="single" w:color="DDDDDD" w:sz="1"/>
               <w:right w:val="single" w:color="DDDDDD" w:sz="1"/>
             </w:tcBorders>
+            <w:shd w:fill="FFFFFF" w:val="clear"/>
             <w:tcMar>
               <w:top w:type="dxa" w:w="80"/>
               <w:left w:type="dxa" w:w="120"/>
@@ -2579,6 +2644,7 @@
               <w:bottom w:val="single" w:color="DDDDDD" w:sz="1"/>
               <w:right w:val="single" w:color="DDDDDD" w:sz="1"/>
             </w:tcBorders>
+            <w:shd w:fill="F0F0F5" w:val="clear"/>
             <w:tcMar>
               <w:top w:type="dxa" w:w="80"/>
               <w:left w:type="dxa" w:w="120"/>
@@ -2607,6 +2673,7 @@
               <w:bottom w:val="single" w:color="DDDDDD" w:sz="1"/>
               <w:right w:val="single" w:color="DDDDDD" w:sz="1"/>
             </w:tcBorders>
+            <w:shd w:fill="F0F0F5" w:val="clear"/>
             <w:tcMar>
               <w:top w:type="dxa" w:w="80"/>
               <w:left w:type="dxa" w:w="120"/>
@@ -2637,6 +2704,7 @@
               <w:bottom w:val="single" w:color="DDDDDD" w:sz="1"/>
               <w:right w:val="single" w:color="DDDDDD" w:sz="1"/>
             </w:tcBorders>
+            <w:shd w:fill="FFFFFF" w:val="clear"/>
             <w:tcMar>
               <w:top w:type="dxa" w:w="80"/>
               <w:left w:type="dxa" w:w="120"/>
@@ -2665,6 +2733,7 @@
               <w:bottom w:val="single" w:color="DDDDDD" w:sz="1"/>
               <w:right w:val="single" w:color="DDDDDD" w:sz="1"/>
             </w:tcBorders>
+            <w:shd w:fill="FFFFFF" w:val="clear"/>
             <w:tcMar>
               <w:top w:type="dxa" w:w="80"/>
               <w:left w:type="dxa" w:w="120"/>
@@ -2965,6 +3034,7 @@
               <w:bottom w:val="single" w:color="DDDDDD" w:sz="1"/>
               <w:right w:val="single" w:color="DDDDDD" w:sz="1"/>
             </w:tcBorders>
+            <w:shd w:fill="FFFFFF" w:val="clear"/>
             <w:tcMar>
               <w:top w:type="dxa" w:w="80"/>
               <w:left w:type="dxa" w:w="120"/>
@@ -2993,6 +3063,7 @@
               <w:bottom w:val="single" w:color="DDDDDD" w:sz="1"/>
               <w:right w:val="single" w:color="DDDDDD" w:sz="1"/>
             </w:tcBorders>
+            <w:shd w:fill="FFFFFF" w:val="clear"/>
             <w:tcMar>
               <w:top w:type="dxa" w:w="80"/>
               <w:left w:type="dxa" w:w="120"/>
@@ -3021,6 +3092,7 @@
               <w:bottom w:val="single" w:color="DDDDDD" w:sz="1"/>
               <w:right w:val="single" w:color="DDDDDD" w:sz="1"/>
             </w:tcBorders>
+            <w:shd w:fill="FFFFFF" w:val="clear"/>
             <w:tcMar>
               <w:top w:type="dxa" w:w="80"/>
               <w:left w:type="dxa" w:w="120"/>
@@ -3049,6 +3121,7 @@
               <w:bottom w:val="single" w:color="DDDDDD" w:sz="1"/>
               <w:right w:val="single" w:color="DDDDDD" w:sz="1"/>
             </w:tcBorders>
+            <w:shd w:fill="FFFFFF" w:val="clear"/>
             <w:tcMar>
               <w:top w:type="dxa" w:w="80"/>
               <w:left w:type="dxa" w:w="120"/>
@@ -3079,6 +3152,7 @@
               <w:bottom w:val="single" w:color="DDDDDD" w:sz="1"/>
               <w:right w:val="single" w:color="DDDDDD" w:sz="1"/>
             </w:tcBorders>
+            <w:shd w:fill="F0F0F5" w:val="clear"/>
             <w:tcMar>
               <w:top w:type="dxa" w:w="80"/>
               <w:left w:type="dxa" w:w="120"/>
@@ -3107,6 +3181,7 @@
               <w:bottom w:val="single" w:color="DDDDDD" w:sz="1"/>
               <w:right w:val="single" w:color="DDDDDD" w:sz="1"/>
             </w:tcBorders>
+            <w:shd w:fill="F0F0F5" w:val="clear"/>
             <w:tcMar>
               <w:top w:type="dxa" w:w="80"/>
               <w:left w:type="dxa" w:w="120"/>
@@ -3135,6 +3210,7 @@
               <w:bottom w:val="single" w:color="DDDDDD" w:sz="1"/>
               <w:right w:val="single" w:color="DDDDDD" w:sz="1"/>
             </w:tcBorders>
+            <w:shd w:fill="F0F0F5" w:val="clear"/>
             <w:tcMar>
               <w:top w:type="dxa" w:w="80"/>
               <w:left w:type="dxa" w:w="120"/>
@@ -3163,6 +3239,7 @@
               <w:bottom w:val="single" w:color="DDDDDD" w:sz="1"/>
               <w:right w:val="single" w:color="DDDDDD" w:sz="1"/>
             </w:tcBorders>
+            <w:shd w:fill="F0F0F5" w:val="clear"/>
             <w:tcMar>
               <w:top w:type="dxa" w:w="80"/>
               <w:left w:type="dxa" w:w="120"/>
@@ -3193,6 +3270,7 @@
               <w:bottom w:val="single" w:color="DDDDDD" w:sz="1"/>
               <w:right w:val="single" w:color="DDDDDD" w:sz="1"/>
             </w:tcBorders>
+            <w:shd w:fill="FFFFFF" w:val="clear"/>
             <w:tcMar>
               <w:top w:type="dxa" w:w="80"/>
               <w:left w:type="dxa" w:w="120"/>
@@ -3221,6 +3299,7 @@
               <w:bottom w:val="single" w:color="DDDDDD" w:sz="1"/>
               <w:right w:val="single" w:color="DDDDDD" w:sz="1"/>
             </w:tcBorders>
+            <w:shd w:fill="FFFFFF" w:val="clear"/>
             <w:tcMar>
               <w:top w:type="dxa" w:w="80"/>
               <w:left w:type="dxa" w:w="120"/>
@@ -3249,6 +3328,7 @@
               <w:bottom w:val="single" w:color="DDDDDD" w:sz="1"/>
               <w:right w:val="single" w:color="DDDDDD" w:sz="1"/>
             </w:tcBorders>
+            <w:shd w:fill="FFFFFF" w:val="clear"/>
             <w:tcMar>
               <w:top w:type="dxa" w:w="80"/>
               <w:left w:type="dxa" w:w="120"/>
@@ -3277,6 +3357,7 @@
               <w:bottom w:val="single" w:color="DDDDDD" w:sz="1"/>
               <w:right w:val="single" w:color="DDDDDD" w:sz="1"/>
             </w:tcBorders>
+            <w:shd w:fill="FFFFFF" w:val="clear"/>
             <w:tcMar>
               <w:top w:type="dxa" w:w="80"/>
               <w:left w:type="dxa" w:w="120"/>
@@ -3307,6 +3388,7 @@
               <w:bottom w:val="single" w:color="DDDDDD" w:sz="1"/>
               <w:right w:val="single" w:color="DDDDDD" w:sz="1"/>
             </w:tcBorders>
+            <w:shd w:fill="F0F0F5" w:val="clear"/>
             <w:tcMar>
               <w:top w:type="dxa" w:w="80"/>
               <w:left w:type="dxa" w:w="120"/>
@@ -3335,6 +3417,7 @@
               <w:bottom w:val="single" w:color="DDDDDD" w:sz="1"/>
               <w:right w:val="single" w:color="DDDDDD" w:sz="1"/>
             </w:tcBorders>
+            <w:shd w:fill="F0F0F5" w:val="clear"/>
             <w:tcMar>
               <w:top w:type="dxa" w:w="80"/>
               <w:left w:type="dxa" w:w="120"/>
@@ -3363,6 +3446,7 @@
               <w:bottom w:val="single" w:color="DDDDDD" w:sz="1"/>
               <w:right w:val="single" w:color="DDDDDD" w:sz="1"/>
             </w:tcBorders>
+            <w:shd w:fill="F0F0F5" w:val="clear"/>
             <w:tcMar>
               <w:top w:type="dxa" w:w="80"/>
               <w:left w:type="dxa" w:w="120"/>
@@ -3391,6 +3475,7 @@
               <w:bottom w:val="single" w:color="DDDDDD" w:sz="1"/>
               <w:right w:val="single" w:color="DDDDDD" w:sz="1"/>
             </w:tcBorders>
+            <w:shd w:fill="F0F0F5" w:val="clear"/>
             <w:tcMar>
               <w:top w:type="dxa" w:w="80"/>
               <w:left w:type="dxa" w:w="120"/>
@@ -3421,6 +3506,7 @@
               <w:bottom w:val="single" w:color="DDDDDD" w:sz="1"/>
               <w:right w:val="single" w:color="DDDDDD" w:sz="1"/>
             </w:tcBorders>
+            <w:shd w:fill="FFFFFF" w:val="clear"/>
             <w:tcMar>
               <w:top w:type="dxa" w:w="80"/>
               <w:left w:type="dxa" w:w="120"/>
@@ -3449,6 +3535,7 @@
               <w:bottom w:val="single" w:color="DDDDDD" w:sz="1"/>
               <w:right w:val="single" w:color="DDDDDD" w:sz="1"/>
             </w:tcBorders>
+            <w:shd w:fill="FFFFFF" w:val="clear"/>
             <w:tcMar>
               <w:top w:type="dxa" w:w="80"/>
               <w:left w:type="dxa" w:w="120"/>
@@ -3477,6 +3564,7 @@
               <w:bottom w:val="single" w:color="DDDDDD" w:sz="1"/>
               <w:right w:val="single" w:color="DDDDDD" w:sz="1"/>
             </w:tcBorders>
+            <w:shd w:fill="FFFFFF" w:val="clear"/>
             <w:tcMar>
               <w:top w:type="dxa" w:w="80"/>
               <w:left w:type="dxa" w:w="120"/>
@@ -3505,6 +3593,7 @@
               <w:bottom w:val="single" w:color="DDDDDD" w:sz="1"/>
               <w:right w:val="single" w:color="DDDDDD" w:sz="1"/>
             </w:tcBorders>
+            <w:shd w:fill="FFFFFF" w:val="clear"/>
             <w:tcMar>
               <w:top w:type="dxa" w:w="80"/>
               <w:left w:type="dxa" w:w="120"/>
@@ -3913,6 +4002,7 @@
               <w:bottom w:val="single" w:color="DDDDDD" w:sz="1"/>
               <w:right w:val="single" w:color="DDDDDD" w:sz="1"/>
             </w:tcBorders>
+            <w:shd w:fill="FFFFFF" w:val="clear"/>
             <w:tcMar>
               <w:top w:type="dxa" w:w="80"/>
               <w:left w:type="dxa" w:w="120"/>
@@ -3941,6 +4031,7 @@
               <w:bottom w:val="single" w:color="DDDDDD" w:sz="1"/>
               <w:right w:val="single" w:color="DDDDDD" w:sz="1"/>
             </w:tcBorders>
+            <w:shd w:fill="FFFFFF" w:val="clear"/>
             <w:tcMar>
               <w:top w:type="dxa" w:w="80"/>
               <w:left w:type="dxa" w:w="120"/>
@@ -3971,6 +4062,7 @@
               <w:bottom w:val="single" w:color="DDDDDD" w:sz="1"/>
               <w:right w:val="single" w:color="DDDDDD" w:sz="1"/>
             </w:tcBorders>
+            <w:shd w:fill="F0F0F5" w:val="clear"/>
             <w:tcMar>
               <w:top w:type="dxa" w:w="80"/>
               <w:left w:type="dxa" w:w="120"/>
@@ -3999,6 +4091,7 @@
               <w:bottom w:val="single" w:color="DDDDDD" w:sz="1"/>
               <w:right w:val="single" w:color="DDDDDD" w:sz="1"/>
             </w:tcBorders>
+            <w:shd w:fill="F0F0F5" w:val="clear"/>
             <w:tcMar>
               <w:top w:type="dxa" w:w="80"/>
               <w:left w:type="dxa" w:w="120"/>
@@ -4029,6 +4122,7 @@
               <w:bottom w:val="single" w:color="DDDDDD" w:sz="1"/>
               <w:right w:val="single" w:color="DDDDDD" w:sz="1"/>
             </w:tcBorders>
+            <w:shd w:fill="FFFFFF" w:val="clear"/>
             <w:tcMar>
               <w:top w:type="dxa" w:w="80"/>
               <w:left w:type="dxa" w:w="120"/>
@@ -4057,6 +4151,7 @@
               <w:bottom w:val="single" w:color="DDDDDD" w:sz="1"/>
               <w:right w:val="single" w:color="DDDDDD" w:sz="1"/>
             </w:tcBorders>
+            <w:shd w:fill="FFFFFF" w:val="clear"/>
             <w:tcMar>
               <w:top w:type="dxa" w:w="80"/>
               <w:left w:type="dxa" w:w="120"/>
@@ -4087,6 +4182,7 @@
               <w:bottom w:val="single" w:color="DDDDDD" w:sz="1"/>
               <w:right w:val="single" w:color="DDDDDD" w:sz="1"/>
             </w:tcBorders>
+            <w:shd w:fill="F0F0F5" w:val="clear"/>
             <w:tcMar>
               <w:top w:type="dxa" w:w="80"/>
               <w:left w:type="dxa" w:w="120"/>
@@ -4115,6 +4211,7 @@
               <w:bottom w:val="single" w:color="DDDDDD" w:sz="1"/>
               <w:right w:val="single" w:color="DDDDDD" w:sz="1"/>
             </w:tcBorders>
+            <w:shd w:fill="F0F0F5" w:val="clear"/>
             <w:tcMar>
               <w:top w:type="dxa" w:w="80"/>
               <w:left w:type="dxa" w:w="120"/>
@@ -4145,6 +4242,7 @@
               <w:bottom w:val="single" w:color="DDDDDD" w:sz="1"/>
               <w:right w:val="single" w:color="DDDDDD" w:sz="1"/>
             </w:tcBorders>
+            <w:shd w:fill="FFFFFF" w:val="clear"/>
             <w:tcMar>
               <w:top w:type="dxa" w:w="80"/>
               <w:left w:type="dxa" w:w="120"/>
@@ -4173,6 +4271,7 @@
               <w:bottom w:val="single" w:color="DDDDDD" w:sz="1"/>
               <w:right w:val="single" w:color="DDDDDD" w:sz="1"/>
             </w:tcBorders>
+            <w:shd w:fill="FFFFFF" w:val="clear"/>
             <w:tcMar>
               <w:top w:type="dxa" w:w="80"/>
               <w:left w:type="dxa" w:w="120"/>
@@ -4203,6 +4302,7 @@
               <w:bottom w:val="single" w:color="DDDDDD" w:sz="1"/>
               <w:right w:val="single" w:color="DDDDDD" w:sz="1"/>
             </w:tcBorders>
+            <w:shd w:fill="F0F0F5" w:val="clear"/>
             <w:tcMar>
               <w:top w:type="dxa" w:w="80"/>
               <w:left w:type="dxa" w:w="120"/>
@@ -4231,6 +4331,7 @@
               <w:bottom w:val="single" w:color="DDDDDD" w:sz="1"/>
               <w:right w:val="single" w:color="DDDDDD" w:sz="1"/>
             </w:tcBorders>
+            <w:shd w:fill="F0F0F5" w:val="clear"/>
             <w:tcMar>
               <w:top w:type="dxa" w:w="80"/>
               <w:left w:type="dxa" w:w="120"/>
@@ -4261,6 +4362,7 @@
               <w:bottom w:val="single" w:color="DDDDDD" w:sz="1"/>
               <w:right w:val="single" w:color="DDDDDD" w:sz="1"/>
             </w:tcBorders>
+            <w:shd w:fill="FFFFFF" w:val="clear"/>
             <w:tcMar>
               <w:top w:type="dxa" w:w="80"/>
               <w:left w:type="dxa" w:w="120"/>
@@ -4289,6 +4391,7 @@
               <w:bottom w:val="single" w:color="DDDDDD" w:sz="1"/>
               <w:right w:val="single" w:color="DDDDDD" w:sz="1"/>
             </w:tcBorders>
+            <w:shd w:fill="FFFFFF" w:val="clear"/>
             <w:tcMar>
               <w:top w:type="dxa" w:w="80"/>
               <w:left w:type="dxa" w:w="120"/>
@@ -4319,6 +4422,7 @@
               <w:bottom w:val="single" w:color="DDDDDD" w:sz="1"/>
               <w:right w:val="single" w:color="DDDDDD" w:sz="1"/>
             </w:tcBorders>
+            <w:shd w:fill="F0F0F5" w:val="clear"/>
             <w:tcMar>
               <w:top w:type="dxa" w:w="80"/>
               <w:left w:type="dxa" w:w="120"/>
@@ -4347,6 +4451,7 @@
               <w:bottom w:val="single" w:color="DDDDDD" w:sz="1"/>
               <w:right w:val="single" w:color="DDDDDD" w:sz="1"/>
             </w:tcBorders>
+            <w:shd w:fill="F0F0F5" w:val="clear"/>
             <w:tcMar>
               <w:top w:type="dxa" w:w="80"/>
               <w:left w:type="dxa" w:w="120"/>
@@ -4377,6 +4482,7 @@
               <w:bottom w:val="single" w:color="DDDDDD" w:sz="1"/>
               <w:right w:val="single" w:color="DDDDDD" w:sz="1"/>
             </w:tcBorders>
+            <w:shd w:fill="FFFFFF" w:val="clear"/>
             <w:tcMar>
               <w:top w:type="dxa" w:w="80"/>
               <w:left w:type="dxa" w:w="120"/>
@@ -4405,6 +4511,7 @@
               <w:bottom w:val="single" w:color="DDDDDD" w:sz="1"/>
               <w:right w:val="single" w:color="DDDDDD" w:sz="1"/>
             </w:tcBorders>
+            <w:shd w:fill="FFFFFF" w:val="clear"/>
             <w:tcMar>
               <w:top w:type="dxa" w:w="80"/>
               <w:left w:type="dxa" w:w="120"/>
@@ -4587,6 +4694,7 @@
               <w:bottom w:val="single" w:color="DDDDDD" w:sz="1"/>
               <w:right w:val="single" w:color="DDDDDD" w:sz="1"/>
             </w:tcBorders>
+            <w:shd w:fill="FFFFFF" w:val="clear"/>
             <w:tcMar>
               <w:top w:type="dxa" w:w="80"/>
               <w:left w:type="dxa" w:w="120"/>
@@ -4615,6 +4723,7 @@
               <w:bottom w:val="single" w:color="DDDDDD" w:sz="1"/>
               <w:right w:val="single" w:color="DDDDDD" w:sz="1"/>
             </w:tcBorders>
+            <w:shd w:fill="FFFFFF" w:val="clear"/>
             <w:tcMar>
               <w:top w:type="dxa" w:w="80"/>
               <w:left w:type="dxa" w:w="120"/>
@@ -4643,6 +4752,7 @@
               <w:bottom w:val="single" w:color="DDDDDD" w:sz="1"/>
               <w:right w:val="single" w:color="DDDDDD" w:sz="1"/>
             </w:tcBorders>
+            <w:shd w:fill="FFFFFF" w:val="clear"/>
             <w:tcMar>
               <w:top w:type="dxa" w:w="80"/>
               <w:left w:type="dxa" w:w="120"/>
@@ -4673,6 +4783,7 @@
               <w:bottom w:val="single" w:color="DDDDDD" w:sz="1"/>
               <w:right w:val="single" w:color="DDDDDD" w:sz="1"/>
             </w:tcBorders>
+            <w:shd w:fill="F0F0F5" w:val="clear"/>
             <w:tcMar>
               <w:top w:type="dxa" w:w="80"/>
               <w:left w:type="dxa" w:w="120"/>
@@ -4701,6 +4812,7 @@
               <w:bottom w:val="single" w:color="DDDDDD" w:sz="1"/>
               <w:right w:val="single" w:color="DDDDDD" w:sz="1"/>
             </w:tcBorders>
+            <w:shd w:fill="F0F0F5" w:val="clear"/>
             <w:tcMar>
               <w:top w:type="dxa" w:w="80"/>
               <w:left w:type="dxa" w:w="120"/>
@@ -4729,6 +4841,7 @@
               <w:bottom w:val="single" w:color="DDDDDD" w:sz="1"/>
               <w:right w:val="single" w:color="DDDDDD" w:sz="1"/>
             </w:tcBorders>
+            <w:shd w:fill="F0F0F5" w:val="clear"/>
             <w:tcMar>
               <w:top w:type="dxa" w:w="80"/>
               <w:left w:type="dxa" w:w="120"/>
@@ -4759,6 +4872,7 @@
               <w:bottom w:val="single" w:color="DDDDDD" w:sz="1"/>
               <w:right w:val="single" w:color="DDDDDD" w:sz="1"/>
             </w:tcBorders>
+            <w:shd w:fill="FFFFFF" w:val="clear"/>
             <w:tcMar>
               <w:top w:type="dxa" w:w="80"/>
               <w:left w:type="dxa" w:w="120"/>
@@ -4787,6 +4901,7 @@
               <w:bottom w:val="single" w:color="DDDDDD" w:sz="1"/>
               <w:right w:val="single" w:color="DDDDDD" w:sz="1"/>
             </w:tcBorders>
+            <w:shd w:fill="FFFFFF" w:val="clear"/>
             <w:tcMar>
               <w:top w:type="dxa" w:w="80"/>
               <w:left w:type="dxa" w:w="120"/>
@@ -4815,6 +4930,7 @@
               <w:bottom w:val="single" w:color="DDDDDD" w:sz="1"/>
               <w:right w:val="single" w:color="DDDDDD" w:sz="1"/>
             </w:tcBorders>
+            <w:shd w:fill="FFFFFF" w:val="clear"/>
             <w:tcMar>
               <w:top w:type="dxa" w:w="80"/>
               <w:left w:type="dxa" w:w="120"/>
@@ -4845,6 +4961,7 @@
               <w:bottom w:val="single" w:color="DDDDDD" w:sz="1"/>
               <w:right w:val="single" w:color="DDDDDD" w:sz="1"/>
             </w:tcBorders>
+            <w:shd w:fill="F0F0F5" w:val="clear"/>
             <w:tcMar>
               <w:top w:type="dxa" w:w="80"/>
               <w:left w:type="dxa" w:w="120"/>
@@ -4873,6 +4990,7 @@
               <w:bottom w:val="single" w:color="DDDDDD" w:sz="1"/>
               <w:right w:val="single" w:color="DDDDDD" w:sz="1"/>
             </w:tcBorders>
+            <w:shd w:fill="F0F0F5" w:val="clear"/>
             <w:tcMar>
               <w:top w:type="dxa" w:w="80"/>
               <w:left w:type="dxa" w:w="120"/>
@@ -4901,6 +5019,7 @@
               <w:bottom w:val="single" w:color="DDDDDD" w:sz="1"/>
               <w:right w:val="single" w:color="DDDDDD" w:sz="1"/>
             </w:tcBorders>
+            <w:shd w:fill="F0F0F5" w:val="clear"/>
             <w:tcMar>
               <w:top w:type="dxa" w:w="80"/>
               <w:left w:type="dxa" w:w="120"/>
@@ -4931,6 +5050,7 @@
               <w:bottom w:val="single" w:color="DDDDDD" w:sz="1"/>
               <w:right w:val="single" w:color="DDDDDD" w:sz="1"/>
             </w:tcBorders>
+            <w:shd w:fill="FFFFFF" w:val="clear"/>
             <w:tcMar>
               <w:top w:type="dxa" w:w="80"/>
               <w:left w:type="dxa" w:w="120"/>
@@ -4959,6 +5079,7 @@
               <w:bottom w:val="single" w:color="DDDDDD" w:sz="1"/>
               <w:right w:val="single" w:color="DDDDDD" w:sz="1"/>
             </w:tcBorders>
+            <w:shd w:fill="FFFFFF" w:val="clear"/>
             <w:tcMar>
               <w:top w:type="dxa" w:w="80"/>
               <w:left w:type="dxa" w:w="120"/>
@@ -4987,6 +5108,7 @@
               <w:bottom w:val="single" w:color="DDDDDD" w:sz="1"/>
               <w:right w:val="single" w:color="DDDDDD" w:sz="1"/>
             </w:tcBorders>
+            <w:shd w:fill="FFFFFF" w:val="clear"/>
             <w:tcMar>
               <w:top w:type="dxa" w:w="80"/>
               <w:left w:type="dxa" w:w="120"/>
@@ -5017,6 +5139,7 @@
               <w:bottom w:val="single" w:color="DDDDDD" w:sz="1"/>
               <w:right w:val="single" w:color="DDDDDD" w:sz="1"/>
             </w:tcBorders>
+            <w:shd w:fill="F0F0F5" w:val="clear"/>
             <w:tcMar>
               <w:top w:type="dxa" w:w="80"/>
               <w:left w:type="dxa" w:w="120"/>
@@ -5045,6 +5168,7 @@
               <w:bottom w:val="single" w:color="DDDDDD" w:sz="1"/>
               <w:right w:val="single" w:color="DDDDDD" w:sz="1"/>
             </w:tcBorders>
+            <w:shd w:fill="F0F0F5" w:val="clear"/>
             <w:tcMar>
               <w:top w:type="dxa" w:w="80"/>
               <w:left w:type="dxa" w:w="120"/>
@@ -5073,6 +5197,7 @@
               <w:bottom w:val="single" w:color="DDDDDD" w:sz="1"/>
               <w:right w:val="single" w:color="DDDDDD" w:sz="1"/>
             </w:tcBorders>
+            <w:shd w:fill="F0F0F5" w:val="clear"/>
             <w:tcMar>
               <w:top w:type="dxa" w:w="80"/>
               <w:left w:type="dxa" w:w="120"/>
@@ -5103,6 +5228,7 @@
               <w:bottom w:val="single" w:color="DDDDDD" w:sz="1"/>
               <w:right w:val="single" w:color="DDDDDD" w:sz="1"/>
             </w:tcBorders>
+            <w:shd w:fill="FFFFFF" w:val="clear"/>
             <w:tcMar>
               <w:top w:type="dxa" w:w="80"/>
               <w:left w:type="dxa" w:w="120"/>
@@ -5131,6 +5257,7 @@
               <w:bottom w:val="single" w:color="DDDDDD" w:sz="1"/>
               <w:right w:val="single" w:color="DDDDDD" w:sz="1"/>
             </w:tcBorders>
+            <w:shd w:fill="FFFFFF" w:val="clear"/>
             <w:tcMar>
               <w:top w:type="dxa" w:w="80"/>
               <w:left w:type="dxa" w:w="120"/>
@@ -5159,6 +5286,7 @@
               <w:bottom w:val="single" w:color="DDDDDD" w:sz="1"/>
               <w:right w:val="single" w:color="DDDDDD" w:sz="1"/>
             </w:tcBorders>
+            <w:shd w:fill="FFFFFF" w:val="clear"/>
             <w:tcMar>
               <w:top w:type="dxa" w:w="80"/>
               <w:left w:type="dxa" w:w="120"/>
@@ -5513,6 +5641,7 @@
               <w:bottom w:val="single" w:color="DDDDDD" w:sz="1"/>
               <w:right w:val="single" w:color="DDDDDD" w:sz="1"/>
             </w:tcBorders>
+            <w:shd w:fill="FFFFFF" w:val="clear"/>
             <w:tcMar>
               <w:top w:type="dxa" w:w="80"/>
               <w:left w:type="dxa" w:w="120"/>
@@ -5541,6 +5670,7 @@
               <w:bottom w:val="single" w:color="DDDDDD" w:sz="1"/>
               <w:right w:val="single" w:color="DDDDDD" w:sz="1"/>
             </w:tcBorders>
+            <w:shd w:fill="FFFFFF" w:val="clear"/>
             <w:tcMar>
               <w:top w:type="dxa" w:w="80"/>
               <w:left w:type="dxa" w:w="120"/>
@@ -5569,6 +5699,7 @@
               <w:bottom w:val="single" w:color="DDDDDD" w:sz="1"/>
               <w:right w:val="single" w:color="DDDDDD" w:sz="1"/>
             </w:tcBorders>
+            <w:shd w:fill="FFFFFF" w:val="clear"/>
             <w:tcMar>
               <w:top w:type="dxa" w:w="80"/>
               <w:left w:type="dxa" w:w="120"/>
@@ -5599,6 +5730,7 @@
               <w:bottom w:val="single" w:color="DDDDDD" w:sz="1"/>
               <w:right w:val="single" w:color="DDDDDD" w:sz="1"/>
             </w:tcBorders>
+            <w:shd w:fill="F0F0F5" w:val="clear"/>
             <w:tcMar>
               <w:top w:type="dxa" w:w="80"/>
               <w:left w:type="dxa" w:w="120"/>
@@ -5627,6 +5759,7 @@
               <w:bottom w:val="single" w:color="DDDDDD" w:sz="1"/>
               <w:right w:val="single" w:color="DDDDDD" w:sz="1"/>
             </w:tcBorders>
+            <w:shd w:fill="F0F0F5" w:val="clear"/>
             <w:tcMar>
               <w:top w:type="dxa" w:w="80"/>
               <w:left w:type="dxa" w:w="120"/>
@@ -5655,6 +5788,7 @@
               <w:bottom w:val="single" w:color="DDDDDD" w:sz="1"/>
               <w:right w:val="single" w:color="DDDDDD" w:sz="1"/>
             </w:tcBorders>
+            <w:shd w:fill="F0F0F5" w:val="clear"/>
             <w:tcMar>
               <w:top w:type="dxa" w:w="80"/>
               <w:left w:type="dxa" w:w="120"/>
@@ -5685,6 +5819,7 @@
               <w:bottom w:val="single" w:color="DDDDDD" w:sz="1"/>
               <w:right w:val="single" w:color="DDDDDD" w:sz="1"/>
             </w:tcBorders>
+            <w:shd w:fill="FFFFFF" w:val="clear"/>
             <w:tcMar>
               <w:top w:type="dxa" w:w="80"/>
               <w:left w:type="dxa" w:w="120"/>
@@ -5713,6 +5848,7 @@
               <w:bottom w:val="single" w:color="DDDDDD" w:sz="1"/>
               <w:right w:val="single" w:color="DDDDDD" w:sz="1"/>
             </w:tcBorders>
+            <w:shd w:fill="FFFFFF" w:val="clear"/>
             <w:tcMar>
               <w:top w:type="dxa" w:w="80"/>
               <w:left w:type="dxa" w:w="120"/>
@@ -5741,6 +5877,7 @@
               <w:bottom w:val="single" w:color="DDDDDD" w:sz="1"/>
               <w:right w:val="single" w:color="DDDDDD" w:sz="1"/>
             </w:tcBorders>
+            <w:shd w:fill="FFFFFF" w:val="clear"/>
             <w:tcMar>
               <w:top w:type="dxa" w:w="80"/>
               <w:left w:type="dxa" w:w="120"/>
@@ -5771,6 +5908,7 @@
               <w:bottom w:val="single" w:color="DDDDDD" w:sz="1"/>
               <w:right w:val="single" w:color="DDDDDD" w:sz="1"/>
             </w:tcBorders>
+            <w:shd w:fill="F0F0F5" w:val="clear"/>
             <w:tcMar>
               <w:top w:type="dxa" w:w="80"/>
               <w:left w:type="dxa" w:w="120"/>
@@ -5799,6 +5937,7 @@
               <w:bottom w:val="single" w:color="DDDDDD" w:sz="1"/>
               <w:right w:val="single" w:color="DDDDDD" w:sz="1"/>
             </w:tcBorders>
+            <w:shd w:fill="F0F0F5" w:val="clear"/>
             <w:tcMar>
               <w:top w:type="dxa" w:w="80"/>
               <w:left w:type="dxa" w:w="120"/>
@@ -5827,6 +5966,7 @@
               <w:bottom w:val="single" w:color="DDDDDD" w:sz="1"/>
               <w:right w:val="single" w:color="DDDDDD" w:sz="1"/>
             </w:tcBorders>
+            <w:shd w:fill="F0F0F5" w:val="clear"/>
             <w:tcMar>
               <w:top w:type="dxa" w:w="80"/>
               <w:left w:type="dxa" w:w="120"/>
@@ -5857,6 +5997,7 @@
               <w:bottom w:val="single" w:color="DDDDDD" w:sz="1"/>
               <w:right w:val="single" w:color="DDDDDD" w:sz="1"/>
             </w:tcBorders>
+            <w:shd w:fill="FFFFFF" w:val="clear"/>
             <w:tcMar>
               <w:top w:type="dxa" w:w="80"/>
               <w:left w:type="dxa" w:w="120"/>
@@ -5885,6 +6026,7 @@
               <w:bottom w:val="single" w:color="DDDDDD" w:sz="1"/>
               <w:right w:val="single" w:color="DDDDDD" w:sz="1"/>
             </w:tcBorders>
+            <w:shd w:fill="FFFFFF" w:val="clear"/>
             <w:tcMar>
               <w:top w:type="dxa" w:w="80"/>
               <w:left w:type="dxa" w:w="120"/>
@@ -5913,6 +6055,7 @@
               <w:bottom w:val="single" w:color="DDDDDD" w:sz="1"/>
               <w:right w:val="single" w:color="DDDDDD" w:sz="1"/>
             </w:tcBorders>
+            <w:shd w:fill="FFFFFF" w:val="clear"/>
             <w:tcMar>
               <w:top w:type="dxa" w:w="80"/>
               <w:left w:type="dxa" w:w="120"/>
@@ -6426,6 +6569,7 @@
               <w:bottom w:val="single" w:color="DDDDDD" w:sz="1"/>
               <w:right w:val="single" w:color="DDDDDD" w:sz="1"/>
             </w:tcBorders>
+            <w:shd w:fill="FFFFFF" w:val="clear"/>
             <w:tcMar>
               <w:top w:type="dxa" w:w="80"/>
               <w:left w:type="dxa" w:w="120"/>
@@ -6454,6 +6598,7 @@
               <w:bottom w:val="single" w:color="DDDDDD" w:sz="1"/>
               <w:right w:val="single" w:color="DDDDDD" w:sz="1"/>
             </w:tcBorders>
+            <w:shd w:fill="FFFFFF" w:val="clear"/>
             <w:tcMar>
               <w:top w:type="dxa" w:w="80"/>
               <w:left w:type="dxa" w:w="120"/>
@@ -6482,6 +6627,7 @@
               <w:bottom w:val="single" w:color="DDDDDD" w:sz="1"/>
               <w:right w:val="single" w:color="DDDDDD" w:sz="1"/>
             </w:tcBorders>
+            <w:shd w:fill="FFFFFF" w:val="clear"/>
             <w:tcMar>
               <w:top w:type="dxa" w:w="80"/>
               <w:left w:type="dxa" w:w="120"/>
@@ -6510,6 +6656,7 @@
               <w:bottom w:val="single" w:color="DDDDDD" w:sz="1"/>
               <w:right w:val="single" w:color="DDDDDD" w:sz="1"/>
             </w:tcBorders>
+            <w:shd w:fill="FFFFFF" w:val="clear"/>
             <w:tcMar>
               <w:top w:type="dxa" w:w="80"/>
               <w:left w:type="dxa" w:w="120"/>
@@ -6540,6 +6687,7 @@
               <w:bottom w:val="single" w:color="DDDDDD" w:sz="1"/>
               <w:right w:val="single" w:color="DDDDDD" w:sz="1"/>
             </w:tcBorders>
+            <w:shd w:fill="F0F0F5" w:val="clear"/>
             <w:tcMar>
               <w:top w:type="dxa" w:w="80"/>
               <w:left w:type="dxa" w:w="120"/>
@@ -6568,6 +6716,7 @@
               <w:bottom w:val="single" w:color="DDDDDD" w:sz="1"/>
               <w:right w:val="single" w:color="DDDDDD" w:sz="1"/>
             </w:tcBorders>
+            <w:shd w:fill="F0F0F5" w:val="clear"/>
             <w:tcMar>
               <w:top w:type="dxa" w:w="80"/>
               <w:left w:type="dxa" w:w="120"/>
@@ -6596,6 +6745,7 @@
               <w:bottom w:val="single" w:color="DDDDDD" w:sz="1"/>
               <w:right w:val="single" w:color="DDDDDD" w:sz="1"/>
             </w:tcBorders>
+            <w:shd w:fill="F0F0F5" w:val="clear"/>
             <w:tcMar>
               <w:top w:type="dxa" w:w="80"/>
               <w:left w:type="dxa" w:w="120"/>
@@ -6624,6 +6774,7 @@
               <w:bottom w:val="single" w:color="DDDDDD" w:sz="1"/>
               <w:right w:val="single" w:color="DDDDDD" w:sz="1"/>
             </w:tcBorders>
+            <w:shd w:fill="F0F0F5" w:val="clear"/>
             <w:tcMar>
               <w:top w:type="dxa" w:w="80"/>
               <w:left w:type="dxa" w:w="120"/>
@@ -6654,6 +6805,7 @@
               <w:bottom w:val="single" w:color="DDDDDD" w:sz="1"/>
               <w:right w:val="single" w:color="DDDDDD" w:sz="1"/>
             </w:tcBorders>
+            <w:shd w:fill="FFFFFF" w:val="clear"/>
             <w:tcMar>
               <w:top w:type="dxa" w:w="80"/>
               <w:left w:type="dxa" w:w="120"/>
@@ -6682,6 +6834,7 @@
               <w:bottom w:val="single" w:color="DDDDDD" w:sz="1"/>
               <w:right w:val="single" w:color="DDDDDD" w:sz="1"/>
             </w:tcBorders>
+            <w:shd w:fill="FFFFFF" w:val="clear"/>
             <w:tcMar>
               <w:top w:type="dxa" w:w="80"/>
               <w:left w:type="dxa" w:w="120"/>
@@ -6710,6 +6863,7 @@
               <w:bottom w:val="single" w:color="DDDDDD" w:sz="1"/>
               <w:right w:val="single" w:color="DDDDDD" w:sz="1"/>
             </w:tcBorders>
+            <w:shd w:fill="FFFFFF" w:val="clear"/>
             <w:tcMar>
               <w:top w:type="dxa" w:w="80"/>
               <w:left w:type="dxa" w:w="120"/>
@@ -6738,6 +6892,7 @@
               <w:bottom w:val="single" w:color="DDDDDD" w:sz="1"/>
               <w:right w:val="single" w:color="DDDDDD" w:sz="1"/>
             </w:tcBorders>
+            <w:shd w:fill="FFFFFF" w:val="clear"/>
             <w:tcMar>
               <w:top w:type="dxa" w:w="80"/>
               <w:left w:type="dxa" w:w="120"/>
@@ -6768,6 +6923,7 @@
               <w:bottom w:val="single" w:color="DDDDDD" w:sz="1"/>
               <w:right w:val="single" w:color="DDDDDD" w:sz="1"/>
             </w:tcBorders>
+            <w:shd w:fill="F0F0F5" w:val="clear"/>
             <w:tcMar>
               <w:top w:type="dxa" w:w="80"/>
               <w:left w:type="dxa" w:w="120"/>
@@ -6796,6 +6952,7 @@
               <w:bottom w:val="single" w:color="DDDDDD" w:sz="1"/>
               <w:right w:val="single" w:color="DDDDDD" w:sz="1"/>
             </w:tcBorders>
+            <w:shd w:fill="F0F0F5" w:val="clear"/>
             <w:tcMar>
               <w:top w:type="dxa" w:w="80"/>
               <w:left w:type="dxa" w:w="120"/>
@@ -6824,6 +6981,7 @@
               <w:bottom w:val="single" w:color="DDDDDD" w:sz="1"/>
               <w:right w:val="single" w:color="DDDDDD" w:sz="1"/>
             </w:tcBorders>
+            <w:shd w:fill="F0F0F5" w:val="clear"/>
             <w:tcMar>
               <w:top w:type="dxa" w:w="80"/>
               <w:left w:type="dxa" w:w="120"/>
@@ -6852,6 +7010,7 @@
               <w:bottom w:val="single" w:color="DDDDDD" w:sz="1"/>
               <w:right w:val="single" w:color="DDDDDD" w:sz="1"/>
             </w:tcBorders>
+            <w:shd w:fill="F0F0F5" w:val="clear"/>
             <w:tcMar>
               <w:top w:type="dxa" w:w="80"/>
               <w:left w:type="dxa" w:w="120"/>
@@ -6882,6 +7041,7 @@
               <w:bottom w:val="single" w:color="DDDDDD" w:sz="1"/>
               <w:right w:val="single" w:color="DDDDDD" w:sz="1"/>
             </w:tcBorders>
+            <w:shd w:fill="FFFFFF" w:val="clear"/>
             <w:tcMar>
               <w:top w:type="dxa" w:w="80"/>
               <w:left w:type="dxa" w:w="120"/>
@@ -6910,6 +7070,7 @@
               <w:bottom w:val="single" w:color="DDDDDD" w:sz="1"/>
               <w:right w:val="single" w:color="DDDDDD" w:sz="1"/>
             </w:tcBorders>
+            <w:shd w:fill="FFFFFF" w:val="clear"/>
             <w:tcMar>
               <w:top w:type="dxa" w:w="80"/>
               <w:left w:type="dxa" w:w="120"/>
@@ -6938,6 +7099,7 @@
               <w:bottom w:val="single" w:color="DDDDDD" w:sz="1"/>
               <w:right w:val="single" w:color="DDDDDD" w:sz="1"/>
             </w:tcBorders>
+            <w:shd w:fill="FFFFFF" w:val="clear"/>
             <w:tcMar>
               <w:top w:type="dxa" w:w="80"/>
               <w:left w:type="dxa" w:w="120"/>
@@ -6966,6 +7128,7 @@
               <w:bottom w:val="single" w:color="DDDDDD" w:sz="1"/>
               <w:right w:val="single" w:color="DDDDDD" w:sz="1"/>
             </w:tcBorders>
+            <w:shd w:fill="FFFFFF" w:val="clear"/>
             <w:tcMar>
               <w:top w:type="dxa" w:w="80"/>
               <w:left w:type="dxa" w:w="120"/>
@@ -6996,6 +7159,7 @@
               <w:bottom w:val="single" w:color="DDDDDD" w:sz="1"/>
               <w:right w:val="single" w:color="DDDDDD" w:sz="1"/>
             </w:tcBorders>
+            <w:shd w:fill="F0F0F5" w:val="clear"/>
             <w:tcMar>
               <w:top w:type="dxa" w:w="80"/>
               <w:left w:type="dxa" w:w="120"/>
@@ -7024,6 +7188,7 @@
               <w:bottom w:val="single" w:color="DDDDDD" w:sz="1"/>
               <w:right w:val="single" w:color="DDDDDD" w:sz="1"/>
             </w:tcBorders>
+            <w:shd w:fill="F0F0F5" w:val="clear"/>
             <w:tcMar>
               <w:top w:type="dxa" w:w="80"/>
               <w:left w:type="dxa" w:w="120"/>
@@ -7052,6 +7217,7 @@
               <w:bottom w:val="single" w:color="DDDDDD" w:sz="1"/>
               <w:right w:val="single" w:color="DDDDDD" w:sz="1"/>
             </w:tcBorders>
+            <w:shd w:fill="F0F0F5" w:val="clear"/>
             <w:tcMar>
               <w:top w:type="dxa" w:w="80"/>
               <w:left w:type="dxa" w:w="120"/>
@@ -7080,6 +7246,7 @@
               <w:bottom w:val="single" w:color="DDDDDD" w:sz="1"/>
               <w:right w:val="single" w:color="DDDDDD" w:sz="1"/>
             </w:tcBorders>
+            <w:shd w:fill="F0F0F5" w:val="clear"/>
             <w:tcMar>
               <w:top w:type="dxa" w:w="80"/>
               <w:left w:type="dxa" w:w="120"/>
@@ -7110,6 +7277,7 @@
               <w:bottom w:val="single" w:color="DDDDDD" w:sz="1"/>
               <w:right w:val="single" w:color="DDDDDD" w:sz="1"/>
             </w:tcBorders>
+            <w:shd w:fill="FFFFFF" w:val="clear"/>
             <w:tcMar>
               <w:top w:type="dxa" w:w="80"/>
               <w:left w:type="dxa" w:w="120"/>
@@ -7138,6 +7306,7 @@
               <w:bottom w:val="single" w:color="DDDDDD" w:sz="1"/>
               <w:right w:val="single" w:color="DDDDDD" w:sz="1"/>
             </w:tcBorders>
+            <w:shd w:fill="FFFFFF" w:val="clear"/>
             <w:tcMar>
               <w:top w:type="dxa" w:w="80"/>
               <w:left w:type="dxa" w:w="120"/>
@@ -7166,6 +7335,7 @@
               <w:bottom w:val="single" w:color="DDDDDD" w:sz="1"/>
               <w:right w:val="single" w:color="DDDDDD" w:sz="1"/>
             </w:tcBorders>
+            <w:shd w:fill="FFFFFF" w:val="clear"/>
             <w:tcMar>
               <w:top w:type="dxa" w:w="80"/>
               <w:left w:type="dxa" w:w="120"/>
@@ -7194,6 +7364,7 @@
               <w:bottom w:val="single" w:color="DDDDDD" w:sz="1"/>
               <w:right w:val="single" w:color="DDDDDD" w:sz="1"/>
             </w:tcBorders>
+            <w:shd w:fill="FFFFFF" w:val="clear"/>
             <w:tcMar>
               <w:top w:type="dxa" w:w="80"/>
               <w:left w:type="dxa" w:w="120"/>
@@ -7391,6 +7562,7 @@
               <w:bottom w:val="single" w:color="DDDDDD" w:sz="1"/>
               <w:right w:val="single" w:color="DDDDDD" w:sz="1"/>
             </w:tcBorders>
+            <w:shd w:fill="FFFFFF" w:val="clear"/>
             <w:tcMar>
               <w:top w:type="dxa" w:w="80"/>
               <w:left w:type="dxa" w:w="120"/>
@@ -7419,6 +7591,7 @@
               <w:bottom w:val="single" w:color="DDDDDD" w:sz="1"/>
               <w:right w:val="single" w:color="DDDDDD" w:sz="1"/>
             </w:tcBorders>
+            <w:shd w:fill="FFFFFF" w:val="clear"/>
             <w:tcMar>
               <w:top w:type="dxa" w:w="80"/>
               <w:left w:type="dxa" w:w="120"/>
@@ -7447,6 +7620,7 @@
               <w:bottom w:val="single" w:color="DDDDDD" w:sz="1"/>
               <w:right w:val="single" w:color="DDDDDD" w:sz="1"/>
             </w:tcBorders>
+            <w:shd w:fill="FFFFFF" w:val="clear"/>
             <w:tcMar>
               <w:top w:type="dxa" w:w="80"/>
               <w:left w:type="dxa" w:w="120"/>
@@ -7475,6 +7649,7 @@
               <w:bottom w:val="single" w:color="DDDDDD" w:sz="1"/>
               <w:right w:val="single" w:color="DDDDDD" w:sz="1"/>
             </w:tcBorders>
+            <w:shd w:fill="FFFFFF" w:val="clear"/>
             <w:tcMar>
               <w:top w:type="dxa" w:w="80"/>
               <w:left w:type="dxa" w:w="120"/>
@@ -7505,6 +7680,7 @@
               <w:bottom w:val="single" w:color="DDDDDD" w:sz="1"/>
               <w:right w:val="single" w:color="DDDDDD" w:sz="1"/>
             </w:tcBorders>
+            <w:shd w:fill="F0F0F5" w:val="clear"/>
             <w:tcMar>
               <w:top w:type="dxa" w:w="80"/>
               <w:left w:type="dxa" w:w="120"/>
@@ -7533,6 +7709,7 @@
               <w:bottom w:val="single" w:color="DDDDDD" w:sz="1"/>
               <w:right w:val="single" w:color="DDDDDD" w:sz="1"/>
             </w:tcBorders>
+            <w:shd w:fill="F0F0F5" w:val="clear"/>
             <w:tcMar>
               <w:top w:type="dxa" w:w="80"/>
               <w:left w:type="dxa" w:w="120"/>
@@ -7561,6 +7738,7 @@
               <w:bottom w:val="single" w:color="DDDDDD" w:sz="1"/>
               <w:right w:val="single" w:color="DDDDDD" w:sz="1"/>
             </w:tcBorders>
+            <w:shd w:fill="F0F0F5" w:val="clear"/>
             <w:tcMar>
               <w:top w:type="dxa" w:w="80"/>
               <w:left w:type="dxa" w:w="120"/>
@@ -7589,6 +7767,7 @@
               <w:bottom w:val="single" w:color="DDDDDD" w:sz="1"/>
               <w:right w:val="single" w:color="DDDDDD" w:sz="1"/>
             </w:tcBorders>
+            <w:shd w:fill="F0F0F5" w:val="clear"/>
             <w:tcMar>
               <w:top w:type="dxa" w:w="80"/>
               <w:left w:type="dxa" w:w="120"/>
@@ -7619,6 +7798,7 @@
               <w:bottom w:val="single" w:color="DDDDDD" w:sz="1"/>
               <w:right w:val="single" w:color="DDDDDD" w:sz="1"/>
             </w:tcBorders>
+            <w:shd w:fill="FFFFFF" w:val="clear"/>
             <w:tcMar>
               <w:top w:type="dxa" w:w="80"/>
               <w:left w:type="dxa" w:w="120"/>
@@ -7647,6 +7827,7 @@
               <w:bottom w:val="single" w:color="DDDDDD" w:sz="1"/>
               <w:right w:val="single" w:color="DDDDDD" w:sz="1"/>
             </w:tcBorders>
+            <w:shd w:fill="FFFFFF" w:val="clear"/>
             <w:tcMar>
               <w:top w:type="dxa" w:w="80"/>
               <w:left w:type="dxa" w:w="120"/>
@@ -7675,6 +7856,7 @@
               <w:bottom w:val="single" w:color="DDDDDD" w:sz="1"/>
               <w:right w:val="single" w:color="DDDDDD" w:sz="1"/>
             </w:tcBorders>
+            <w:shd w:fill="FFFFFF" w:val="clear"/>
             <w:tcMar>
               <w:top w:type="dxa" w:w="80"/>
               <w:left w:type="dxa" w:w="120"/>
@@ -7703,6 +7885,7 @@
               <w:bottom w:val="single" w:color="DDDDDD" w:sz="1"/>
               <w:right w:val="single" w:color="DDDDDD" w:sz="1"/>
             </w:tcBorders>
+            <w:shd w:fill="FFFFFF" w:val="clear"/>
             <w:tcMar>
               <w:top w:type="dxa" w:w="80"/>
               <w:left w:type="dxa" w:w="120"/>
@@ -7733,6 +7916,7 @@
               <w:bottom w:val="single" w:color="DDDDDD" w:sz="1"/>
               <w:right w:val="single" w:color="DDDDDD" w:sz="1"/>
             </w:tcBorders>
+            <w:shd w:fill="F0F0F5" w:val="clear"/>
             <w:tcMar>
               <w:top w:type="dxa" w:w="80"/>
               <w:left w:type="dxa" w:w="120"/>
@@ -7761,6 +7945,7 @@
               <w:bottom w:val="single" w:color="DDDDDD" w:sz="1"/>
               <w:right w:val="single" w:color="DDDDDD" w:sz="1"/>
             </w:tcBorders>
+            <w:shd w:fill="F0F0F5" w:val="clear"/>
             <w:tcMar>
               <w:top w:type="dxa" w:w="80"/>
               <w:left w:type="dxa" w:w="120"/>
@@ -7789,6 +7974,7 @@
               <w:bottom w:val="single" w:color="DDDDDD" w:sz="1"/>
               <w:right w:val="single" w:color="DDDDDD" w:sz="1"/>
             </w:tcBorders>
+            <w:shd w:fill="F0F0F5" w:val="clear"/>
             <w:tcMar>
               <w:top w:type="dxa" w:w="80"/>
               <w:left w:type="dxa" w:w="120"/>
@@ -7817,6 +8003,7 @@
               <w:bottom w:val="single" w:color="DDDDDD" w:sz="1"/>
               <w:right w:val="single" w:color="DDDDDD" w:sz="1"/>
             </w:tcBorders>
+            <w:shd w:fill="F0F0F5" w:val="clear"/>
             <w:tcMar>
               <w:top w:type="dxa" w:w="80"/>
               <w:left w:type="dxa" w:w="120"/>
@@ -7847,6 +8034,7 @@
               <w:bottom w:val="single" w:color="DDDDDD" w:sz="1"/>
               <w:right w:val="single" w:color="DDDDDD" w:sz="1"/>
             </w:tcBorders>
+            <w:shd w:fill="FFFFFF" w:val="clear"/>
             <w:tcMar>
               <w:top w:type="dxa" w:w="80"/>
               <w:left w:type="dxa" w:w="120"/>
@@ -7875,6 +8063,7 @@
               <w:bottom w:val="single" w:color="DDDDDD" w:sz="1"/>
               <w:right w:val="single" w:color="DDDDDD" w:sz="1"/>
             </w:tcBorders>
+            <w:shd w:fill="FFFFFF" w:val="clear"/>
             <w:tcMar>
               <w:top w:type="dxa" w:w="80"/>
               <w:left w:type="dxa" w:w="120"/>
@@ -7903,6 +8092,7 @@
               <w:bottom w:val="single" w:color="DDDDDD" w:sz="1"/>
               <w:right w:val="single" w:color="DDDDDD" w:sz="1"/>
             </w:tcBorders>
+            <w:shd w:fill="FFFFFF" w:val="clear"/>
             <w:tcMar>
               <w:top w:type="dxa" w:w="80"/>
               <w:left w:type="dxa" w:w="120"/>
@@ -7931,6 +8121,7 @@
               <w:bottom w:val="single" w:color="DDDDDD" w:sz="1"/>
               <w:right w:val="single" w:color="DDDDDD" w:sz="1"/>
             </w:tcBorders>
+            <w:shd w:fill="FFFFFF" w:val="clear"/>
             <w:tcMar>
               <w:top w:type="dxa" w:w="80"/>
               <w:left w:type="dxa" w:w="120"/>
@@ -8175,6 +8366,7 @@
               <w:bottom w:val="single" w:color="DDDDDD" w:sz="1"/>
               <w:right w:val="single" w:color="DDDDDD" w:sz="1"/>
             </w:tcBorders>
+            <w:shd w:fill="FFFFFF" w:val="clear"/>
             <w:tcMar>
               <w:top w:type="dxa" w:w="80"/>
               <w:left w:type="dxa" w:w="120"/>
@@ -8203,6 +8395,7 @@
               <w:bottom w:val="single" w:color="DDDDDD" w:sz="1"/>
               <w:right w:val="single" w:color="DDDDDD" w:sz="1"/>
             </w:tcBorders>
+            <w:shd w:fill="FFFFFF" w:val="clear"/>
             <w:tcMar>
               <w:top w:type="dxa" w:w="80"/>
               <w:left w:type="dxa" w:w="120"/>
@@ -8231,6 +8424,7 @@
               <w:bottom w:val="single" w:color="DDDDDD" w:sz="1"/>
               <w:right w:val="single" w:color="DDDDDD" w:sz="1"/>
             </w:tcBorders>
+            <w:shd w:fill="FFFFFF" w:val="clear"/>
             <w:tcMar>
               <w:top w:type="dxa" w:w="80"/>
               <w:left w:type="dxa" w:w="120"/>
@@ -8259,6 +8453,7 @@
               <w:bottom w:val="single" w:color="DDDDDD" w:sz="1"/>
               <w:right w:val="single" w:color="DDDDDD" w:sz="1"/>
             </w:tcBorders>
+            <w:shd w:fill="FFFFFF" w:val="clear"/>
             <w:tcMar>
               <w:top w:type="dxa" w:w="80"/>
               <w:left w:type="dxa" w:w="120"/>
@@ -8287,6 +8482,7 @@
               <w:bottom w:val="single" w:color="DDDDDD" w:sz="1"/>
               <w:right w:val="single" w:color="DDDDDD" w:sz="1"/>
             </w:tcBorders>
+            <w:shd w:fill="FFFFFF" w:val="clear"/>
             <w:tcMar>
               <w:top w:type="dxa" w:w="80"/>
               <w:left w:type="dxa" w:w="120"/>
@@ -8317,6 +8513,7 @@
               <w:bottom w:val="single" w:color="DDDDDD" w:sz="1"/>
               <w:right w:val="single" w:color="DDDDDD" w:sz="1"/>
             </w:tcBorders>
+            <w:shd w:fill="F0F0F5" w:val="clear"/>
             <w:tcMar>
               <w:top w:type="dxa" w:w="80"/>
               <w:left w:type="dxa" w:w="120"/>
@@ -8345,6 +8542,7 @@
               <w:bottom w:val="single" w:color="DDDDDD" w:sz="1"/>
               <w:right w:val="single" w:color="DDDDDD" w:sz="1"/>
             </w:tcBorders>
+            <w:shd w:fill="F0F0F5" w:val="clear"/>
             <w:tcMar>
               <w:top w:type="dxa" w:w="80"/>
               <w:left w:type="dxa" w:w="120"/>
@@ -8373,6 +8571,7 @@
               <w:bottom w:val="single" w:color="DDDDDD" w:sz="1"/>
               <w:right w:val="single" w:color="DDDDDD" w:sz="1"/>
             </w:tcBorders>
+            <w:shd w:fill="F0F0F5" w:val="clear"/>
             <w:tcMar>
               <w:top w:type="dxa" w:w="80"/>
               <w:left w:type="dxa" w:w="120"/>
@@ -8401,6 +8600,7 @@
               <w:bottom w:val="single" w:color="DDDDDD" w:sz="1"/>
               <w:right w:val="single" w:color="DDDDDD" w:sz="1"/>
             </w:tcBorders>
+            <w:shd w:fill="F0F0F5" w:val="clear"/>
             <w:tcMar>
               <w:top w:type="dxa" w:w="80"/>
               <w:left w:type="dxa" w:w="120"/>
@@ -8429,6 +8629,7 @@
               <w:bottom w:val="single" w:color="DDDDDD" w:sz="1"/>
               <w:right w:val="single" w:color="DDDDDD" w:sz="1"/>
             </w:tcBorders>
+            <w:shd w:fill="F0F0F5" w:val="clear"/>
             <w:tcMar>
               <w:top w:type="dxa" w:w="80"/>
               <w:left w:type="dxa" w:w="120"/>
@@ -8459,6 +8660,7 @@
               <w:bottom w:val="single" w:color="DDDDDD" w:sz="1"/>
               <w:right w:val="single" w:color="DDDDDD" w:sz="1"/>
             </w:tcBorders>
+            <w:shd w:fill="FFFFFF" w:val="clear"/>
             <w:tcMar>
               <w:top w:type="dxa" w:w="80"/>
               <w:left w:type="dxa" w:w="120"/>
@@ -8487,6 +8689,7 @@
               <w:bottom w:val="single" w:color="DDDDDD" w:sz="1"/>
               <w:right w:val="single" w:color="DDDDDD" w:sz="1"/>
             </w:tcBorders>
+            <w:shd w:fill="FFFFFF" w:val="clear"/>
             <w:tcMar>
               <w:top w:type="dxa" w:w="80"/>
               <w:left w:type="dxa" w:w="120"/>
@@ -8515,6 +8718,7 @@
               <w:bottom w:val="single" w:color="DDDDDD" w:sz="1"/>
               <w:right w:val="single" w:color="DDDDDD" w:sz="1"/>
             </w:tcBorders>
+            <w:shd w:fill="FFFFFF" w:val="clear"/>
             <w:tcMar>
               <w:top w:type="dxa" w:w="80"/>
               <w:left w:type="dxa" w:w="120"/>
@@ -8543,6 +8747,7 @@
               <w:bottom w:val="single" w:color="DDDDDD" w:sz="1"/>
               <w:right w:val="single" w:color="DDDDDD" w:sz="1"/>
             </w:tcBorders>
+            <w:shd w:fill="FFFFFF" w:val="clear"/>
             <w:tcMar>
               <w:top w:type="dxa" w:w="80"/>
               <w:left w:type="dxa" w:w="120"/>
@@ -8571,6 +8776,7 @@
               <w:bottom w:val="single" w:color="DDDDDD" w:sz="1"/>
               <w:right w:val="single" w:color="DDDDDD" w:sz="1"/>
             </w:tcBorders>
+            <w:shd w:fill="FFFFFF" w:val="clear"/>
             <w:tcMar>
               <w:top w:type="dxa" w:w="80"/>
               <w:left w:type="dxa" w:w="120"/>
@@ -8601,6 +8807,7 @@
               <w:bottom w:val="single" w:color="DDDDDD" w:sz="1"/>
               <w:right w:val="single" w:color="DDDDDD" w:sz="1"/>
             </w:tcBorders>
+            <w:shd w:fill="F0F0F5" w:val="clear"/>
             <w:tcMar>
               <w:top w:type="dxa" w:w="80"/>
               <w:left w:type="dxa" w:w="120"/>
@@ -8629,6 +8836,7 @@
               <w:bottom w:val="single" w:color="DDDDDD" w:sz="1"/>
               <w:right w:val="single" w:color="DDDDDD" w:sz="1"/>
             </w:tcBorders>
+            <w:shd w:fill="F0F0F5" w:val="clear"/>
             <w:tcMar>
               <w:top w:type="dxa" w:w="80"/>
               <w:left w:type="dxa" w:w="120"/>
@@ -8657,6 +8865,7 @@
               <w:bottom w:val="single" w:color="DDDDDD" w:sz="1"/>
               <w:right w:val="single" w:color="DDDDDD" w:sz="1"/>
             </w:tcBorders>
+            <w:shd w:fill="F0F0F5" w:val="clear"/>
             <w:tcMar>
               <w:top w:type="dxa" w:w="80"/>
               <w:left w:type="dxa" w:w="120"/>
@@ -8685,6 +8894,7 @@
               <w:bottom w:val="single" w:color="DDDDDD" w:sz="1"/>
               <w:right w:val="single" w:color="DDDDDD" w:sz="1"/>
             </w:tcBorders>
+            <w:shd w:fill="F0F0F5" w:val="clear"/>
             <w:tcMar>
               <w:top w:type="dxa" w:w="80"/>
               <w:left w:type="dxa" w:w="120"/>
@@ -8713,6 +8923,7 @@
               <w:bottom w:val="single" w:color="DDDDDD" w:sz="1"/>
               <w:right w:val="single" w:color="DDDDDD" w:sz="1"/>
             </w:tcBorders>
+            <w:shd w:fill="F0F0F5" w:val="clear"/>
             <w:tcMar>
               <w:top w:type="dxa" w:w="80"/>
               <w:left w:type="dxa" w:w="120"/>
@@ -8743,6 +8954,7 @@
               <w:bottom w:val="single" w:color="DDDDDD" w:sz="1"/>
               <w:right w:val="single" w:color="DDDDDD" w:sz="1"/>
             </w:tcBorders>
+            <w:shd w:fill="FFFFFF" w:val="clear"/>
             <w:tcMar>
               <w:top w:type="dxa" w:w="80"/>
               <w:left w:type="dxa" w:w="120"/>
@@ -8771,6 +8983,7 @@
               <w:bottom w:val="single" w:color="DDDDDD" w:sz="1"/>
               <w:right w:val="single" w:color="DDDDDD" w:sz="1"/>
             </w:tcBorders>
+            <w:shd w:fill="FFFFFF" w:val="clear"/>
             <w:tcMar>
               <w:top w:type="dxa" w:w="80"/>
               <w:left w:type="dxa" w:w="120"/>
@@ -8799,6 +9012,7 @@
               <w:bottom w:val="single" w:color="DDDDDD" w:sz="1"/>
               <w:right w:val="single" w:color="DDDDDD" w:sz="1"/>
             </w:tcBorders>
+            <w:shd w:fill="FFFFFF" w:val="clear"/>
             <w:tcMar>
               <w:top w:type="dxa" w:w="80"/>
               <w:left w:type="dxa" w:w="120"/>
@@ -8827,6 +9041,7 @@
               <w:bottom w:val="single" w:color="DDDDDD" w:sz="1"/>
               <w:right w:val="single" w:color="DDDDDD" w:sz="1"/>
             </w:tcBorders>
+            <w:shd w:fill="FFFFFF" w:val="clear"/>
             <w:tcMar>
               <w:top w:type="dxa" w:w="80"/>
               <w:left w:type="dxa" w:w="120"/>
@@ -8855,6 +9070,7 @@
               <w:bottom w:val="single" w:color="DDDDDD" w:sz="1"/>
               <w:right w:val="single" w:color="DDDDDD" w:sz="1"/>
             </w:tcBorders>
+            <w:shd w:fill="FFFFFF" w:val="clear"/>
             <w:tcMar>
               <w:top w:type="dxa" w:w="80"/>
               <w:left w:type="dxa" w:w="120"/>
@@ -8885,6 +9101,7 @@
               <w:bottom w:val="single" w:color="DDDDDD" w:sz="1"/>
               <w:right w:val="single" w:color="DDDDDD" w:sz="1"/>
             </w:tcBorders>
+            <w:shd w:fill="F0F0F5" w:val="clear"/>
             <w:tcMar>
               <w:top w:type="dxa" w:w="80"/>
               <w:left w:type="dxa" w:w="120"/>
@@ -8913,6 +9130,7 @@
               <w:bottom w:val="single" w:color="DDDDDD" w:sz="1"/>
               <w:right w:val="single" w:color="DDDDDD" w:sz="1"/>
             </w:tcBorders>
+            <w:shd w:fill="F0F0F5" w:val="clear"/>
             <w:tcMar>
               <w:top w:type="dxa" w:w="80"/>
               <w:left w:type="dxa" w:w="120"/>
@@ -8941,6 +9159,7 @@
               <w:bottom w:val="single" w:color="DDDDDD" w:sz="1"/>
               <w:right w:val="single" w:color="DDDDDD" w:sz="1"/>
             </w:tcBorders>
+            <w:shd w:fill="F0F0F5" w:val="clear"/>
             <w:tcMar>
               <w:top w:type="dxa" w:w="80"/>
               <w:left w:type="dxa" w:w="120"/>
@@ -8969,6 +9188,7 @@
               <w:bottom w:val="single" w:color="DDDDDD" w:sz="1"/>
               <w:right w:val="single" w:color="DDDDDD" w:sz="1"/>
             </w:tcBorders>
+            <w:shd w:fill="F0F0F5" w:val="clear"/>
             <w:tcMar>
               <w:top w:type="dxa" w:w="80"/>
               <w:left w:type="dxa" w:w="120"/>
@@ -8997,6 +9217,7 @@
               <w:bottom w:val="single" w:color="DDDDDD" w:sz="1"/>
               <w:right w:val="single" w:color="DDDDDD" w:sz="1"/>
             </w:tcBorders>
+            <w:shd w:fill="F0F0F5" w:val="clear"/>
             <w:tcMar>
               <w:top w:type="dxa" w:w="80"/>
               <w:left w:type="dxa" w:w="120"/>
@@ -9027,6 +9248,7 @@
               <w:bottom w:val="single" w:color="DDDDDD" w:sz="1"/>
               <w:right w:val="single" w:color="DDDDDD" w:sz="1"/>
             </w:tcBorders>
+            <w:shd w:fill="FFFFFF" w:val="clear"/>
             <w:tcMar>
               <w:top w:type="dxa" w:w="80"/>
               <w:left w:type="dxa" w:w="120"/>
@@ -9055,6 +9277,7 @@
               <w:bottom w:val="single" w:color="DDDDDD" w:sz="1"/>
               <w:right w:val="single" w:color="DDDDDD" w:sz="1"/>
             </w:tcBorders>
+            <w:shd w:fill="FFFFFF" w:val="clear"/>
             <w:tcMar>
               <w:top w:type="dxa" w:w="80"/>
               <w:left w:type="dxa" w:w="120"/>
@@ -9083,6 +9306,7 @@
               <w:bottom w:val="single" w:color="DDDDDD" w:sz="1"/>
               <w:right w:val="single" w:color="DDDDDD" w:sz="1"/>
             </w:tcBorders>
+            <w:shd w:fill="FFFFFF" w:val="clear"/>
             <w:tcMar>
               <w:top w:type="dxa" w:w="80"/>
               <w:left w:type="dxa" w:w="120"/>
@@ -9111,6 +9335,7 @@
               <w:bottom w:val="single" w:color="DDDDDD" w:sz="1"/>
               <w:right w:val="single" w:color="DDDDDD" w:sz="1"/>
             </w:tcBorders>
+            <w:shd w:fill="FFFFFF" w:val="clear"/>
             <w:tcMar>
               <w:top w:type="dxa" w:w="80"/>
               <w:left w:type="dxa" w:w="120"/>
@@ -9139,6 +9364,7 @@
               <w:bottom w:val="single" w:color="DDDDDD" w:sz="1"/>
               <w:right w:val="single" w:color="DDDDDD" w:sz="1"/>
             </w:tcBorders>
+            <w:shd w:fill="FFFFFF" w:val="clear"/>
             <w:tcMar>
               <w:top w:type="dxa" w:w="80"/>
               <w:left w:type="dxa" w:w="120"/>
@@ -9373,6 +9599,7 @@
               <w:bottom w:val="single" w:color="DDDDDD" w:sz="1"/>
               <w:right w:val="single" w:color="DDDDDD" w:sz="1"/>
             </w:tcBorders>
+            <w:shd w:fill="FFFFFF" w:val="clear"/>
             <w:tcMar>
               <w:top w:type="dxa" w:w="80"/>
               <w:left w:type="dxa" w:w="120"/>
@@ -9401,6 +9628,7 @@
               <w:bottom w:val="single" w:color="DDDDDD" w:sz="1"/>
               <w:right w:val="single" w:color="DDDDDD" w:sz="1"/>
             </w:tcBorders>
+            <w:shd w:fill="FFFFFF" w:val="clear"/>
             <w:tcMar>
               <w:top w:type="dxa" w:w="80"/>
               <w:left w:type="dxa" w:w="120"/>
@@ -9429,6 +9657,7 @@
               <w:bottom w:val="single" w:color="DDDDDD" w:sz="1"/>
               <w:right w:val="single" w:color="DDDDDD" w:sz="1"/>
             </w:tcBorders>
+            <w:shd w:fill="FFFFFF" w:val="clear"/>
             <w:tcMar>
               <w:top w:type="dxa" w:w="80"/>
               <w:left w:type="dxa" w:w="120"/>
@@ -9457,6 +9686,7 @@
               <w:bottom w:val="single" w:color="DDDDDD" w:sz="1"/>
               <w:right w:val="single" w:color="DDDDDD" w:sz="1"/>
             </w:tcBorders>
+            <w:shd w:fill="FFFFFF" w:val="clear"/>
             <w:tcMar>
               <w:top w:type="dxa" w:w="80"/>
               <w:left w:type="dxa" w:w="120"/>
@@ -9487,6 +9717,7 @@
               <w:bottom w:val="single" w:color="DDDDDD" w:sz="1"/>
               <w:right w:val="single" w:color="DDDDDD" w:sz="1"/>
             </w:tcBorders>
+            <w:shd w:fill="F0F0F5" w:val="clear"/>
             <w:tcMar>
               <w:top w:type="dxa" w:w="80"/>
               <w:left w:type="dxa" w:w="120"/>
@@ -9515,6 +9746,7 @@
               <w:bottom w:val="single" w:color="DDDDDD" w:sz="1"/>
               <w:right w:val="single" w:color="DDDDDD" w:sz="1"/>
             </w:tcBorders>
+            <w:shd w:fill="F0F0F5" w:val="clear"/>
             <w:tcMar>
               <w:top w:type="dxa" w:w="80"/>
               <w:left w:type="dxa" w:w="120"/>
@@ -9543,6 +9775,7 @@
               <w:bottom w:val="single" w:color="DDDDDD" w:sz="1"/>
               <w:right w:val="single" w:color="DDDDDD" w:sz="1"/>
             </w:tcBorders>
+            <w:shd w:fill="F0F0F5" w:val="clear"/>
             <w:tcMar>
               <w:top w:type="dxa" w:w="80"/>
               <w:left w:type="dxa" w:w="120"/>
@@ -9571,6 +9804,7 @@
               <w:bottom w:val="single" w:color="DDDDDD" w:sz="1"/>
               <w:right w:val="single" w:color="DDDDDD" w:sz="1"/>
             </w:tcBorders>
+            <w:shd w:fill="F0F0F5" w:val="clear"/>
             <w:tcMar>
               <w:top w:type="dxa" w:w="80"/>
               <w:left w:type="dxa" w:w="120"/>
@@ -9601,6 +9835,7 @@
               <w:bottom w:val="single" w:color="DDDDDD" w:sz="1"/>
               <w:right w:val="single" w:color="DDDDDD" w:sz="1"/>
             </w:tcBorders>
+            <w:shd w:fill="FFFFFF" w:val="clear"/>
             <w:tcMar>
               <w:top w:type="dxa" w:w="80"/>
               <w:left w:type="dxa" w:w="120"/>
@@ -9629,6 +9864,7 @@
               <w:bottom w:val="single" w:color="DDDDDD" w:sz="1"/>
               <w:right w:val="single" w:color="DDDDDD" w:sz="1"/>
             </w:tcBorders>
+            <w:shd w:fill="FFFFFF" w:val="clear"/>
             <w:tcMar>
               <w:top w:type="dxa" w:w="80"/>
               <w:left w:type="dxa" w:w="120"/>
@@ -9657,6 +9893,7 @@
               <w:bottom w:val="single" w:color="DDDDDD" w:sz="1"/>
               <w:right w:val="single" w:color="DDDDDD" w:sz="1"/>
             </w:tcBorders>
+            <w:shd w:fill="FFFFFF" w:val="clear"/>
             <w:tcMar>
               <w:top w:type="dxa" w:w="80"/>
               <w:left w:type="dxa" w:w="120"/>
@@ -9685,6 +9922,7 @@
               <w:bottom w:val="single" w:color="DDDDDD" w:sz="1"/>
               <w:right w:val="single" w:color="DDDDDD" w:sz="1"/>
             </w:tcBorders>
+            <w:shd w:fill="FFFFFF" w:val="clear"/>
             <w:tcMar>
               <w:top w:type="dxa" w:w="80"/>
               <w:left w:type="dxa" w:w="120"/>
@@ -9715,6 +9953,7 @@
               <w:bottom w:val="single" w:color="DDDDDD" w:sz="1"/>
               <w:right w:val="single" w:color="DDDDDD" w:sz="1"/>
             </w:tcBorders>
+            <w:shd w:fill="F0F0F5" w:val="clear"/>
             <w:tcMar>
               <w:top w:type="dxa" w:w="80"/>
               <w:left w:type="dxa" w:w="120"/>
@@ -9743,6 +9982,7 @@
               <w:bottom w:val="single" w:color="DDDDDD" w:sz="1"/>
               <w:right w:val="single" w:color="DDDDDD" w:sz="1"/>
             </w:tcBorders>
+            <w:shd w:fill="F0F0F5" w:val="clear"/>
             <w:tcMar>
               <w:top w:type="dxa" w:w="80"/>
               <w:left w:type="dxa" w:w="120"/>
@@ -9771,6 +10011,7 @@
               <w:bottom w:val="single" w:color="DDDDDD" w:sz="1"/>
               <w:right w:val="single" w:color="DDDDDD" w:sz="1"/>
             </w:tcBorders>
+            <w:shd w:fill="F0F0F5" w:val="clear"/>
             <w:tcMar>
               <w:top w:type="dxa" w:w="80"/>
               <w:left w:type="dxa" w:w="120"/>
@@ -9799,6 +10040,7 @@
               <w:bottom w:val="single" w:color="DDDDDD" w:sz="1"/>
               <w:right w:val="single" w:color="DDDDDD" w:sz="1"/>
             </w:tcBorders>
+            <w:shd w:fill="F0F0F5" w:val="clear"/>
             <w:tcMar>
               <w:top w:type="dxa" w:w="80"/>
               <w:left w:type="dxa" w:w="120"/>
@@ -10441,6 +10683,7 @@
               <w:bottom w:val="single" w:color="DDDDDD" w:sz="1"/>
               <w:right w:val="single" w:color="DDDDDD" w:sz="1"/>
             </w:tcBorders>
+            <w:shd w:fill="FFFFFF" w:val="clear"/>
             <w:tcMar>
               <w:top w:type="dxa" w:w="80"/>
               <w:left w:type="dxa" w:w="120"/>
@@ -10469,6 +10712,7 @@
               <w:bottom w:val="single" w:color="DDDDDD" w:sz="1"/>
               <w:right w:val="single" w:color="DDDDDD" w:sz="1"/>
             </w:tcBorders>
+            <w:shd w:fill="FFFFFF" w:val="clear"/>
             <w:tcMar>
               <w:top w:type="dxa" w:w="80"/>
               <w:left w:type="dxa" w:w="120"/>
@@ -10497,6 +10741,7 @@
               <w:bottom w:val="single" w:color="DDDDDD" w:sz="1"/>
               <w:right w:val="single" w:color="DDDDDD" w:sz="1"/>
             </w:tcBorders>
+            <w:shd w:fill="FFFFFF" w:val="clear"/>
             <w:tcMar>
               <w:top w:type="dxa" w:w="80"/>
               <w:left w:type="dxa" w:w="120"/>
@@ -10525,6 +10770,7 @@
               <w:bottom w:val="single" w:color="DDDDDD" w:sz="1"/>
               <w:right w:val="single" w:color="DDDDDD" w:sz="1"/>
             </w:tcBorders>
+            <w:shd w:fill="FFFFFF" w:val="clear"/>
             <w:tcMar>
               <w:top w:type="dxa" w:w="80"/>
               <w:left w:type="dxa" w:w="120"/>
@@ -10555,6 +10801,7 @@
               <w:bottom w:val="single" w:color="DDDDDD" w:sz="1"/>
               <w:right w:val="single" w:color="DDDDDD" w:sz="1"/>
             </w:tcBorders>
+            <w:shd w:fill="F0F0F5" w:val="clear"/>
             <w:tcMar>
               <w:top w:type="dxa" w:w="80"/>
               <w:left w:type="dxa" w:w="120"/>
@@ -10583,6 +10830,7 @@
               <w:bottom w:val="single" w:color="DDDDDD" w:sz="1"/>
               <w:right w:val="single" w:color="DDDDDD" w:sz="1"/>
             </w:tcBorders>
+            <w:shd w:fill="F0F0F5" w:val="clear"/>
             <w:tcMar>
               <w:top w:type="dxa" w:w="80"/>
               <w:left w:type="dxa" w:w="120"/>
@@ -10611,6 +10859,7 @@
               <w:bottom w:val="single" w:color="DDDDDD" w:sz="1"/>
               <w:right w:val="single" w:color="DDDDDD" w:sz="1"/>
             </w:tcBorders>
+            <w:shd w:fill="F0F0F5" w:val="clear"/>
             <w:tcMar>
               <w:top w:type="dxa" w:w="80"/>
               <w:left w:type="dxa" w:w="120"/>
@@ -10639,6 +10888,7 @@
               <w:bottom w:val="single" w:color="DDDDDD" w:sz="1"/>
               <w:right w:val="single" w:color="DDDDDD" w:sz="1"/>
             </w:tcBorders>
+            <w:shd w:fill="F0F0F5" w:val="clear"/>
             <w:tcMar>
               <w:top w:type="dxa" w:w="80"/>
               <w:left w:type="dxa" w:w="120"/>
@@ -10669,6 +10919,7 @@
               <w:bottom w:val="single" w:color="DDDDDD" w:sz="1"/>
               <w:right w:val="single" w:color="DDDDDD" w:sz="1"/>
             </w:tcBorders>
+            <w:shd w:fill="FFFFFF" w:val="clear"/>
             <w:tcMar>
               <w:top w:type="dxa" w:w="80"/>
               <w:left w:type="dxa" w:w="120"/>
@@ -10697,6 +10948,7 @@
               <w:bottom w:val="single" w:color="DDDDDD" w:sz="1"/>
               <w:right w:val="single" w:color="DDDDDD" w:sz="1"/>
             </w:tcBorders>
+            <w:shd w:fill="FFFFFF" w:val="clear"/>
             <w:tcMar>
               <w:top w:type="dxa" w:w="80"/>
               <w:left w:type="dxa" w:w="120"/>
@@ -10725,6 +10977,7 @@
               <w:bottom w:val="single" w:color="DDDDDD" w:sz="1"/>
               <w:right w:val="single" w:color="DDDDDD" w:sz="1"/>
             </w:tcBorders>
+            <w:shd w:fill="FFFFFF" w:val="clear"/>
             <w:tcMar>
               <w:top w:type="dxa" w:w="80"/>
               <w:left w:type="dxa" w:w="120"/>
@@ -10753,6 +11006,7 @@
               <w:bottom w:val="single" w:color="DDDDDD" w:sz="1"/>
               <w:right w:val="single" w:color="DDDDDD" w:sz="1"/>
             </w:tcBorders>
+            <w:shd w:fill="FFFFFF" w:val="clear"/>
             <w:tcMar>
               <w:top w:type="dxa" w:w="80"/>
               <w:left w:type="dxa" w:w="120"/>
@@ -10783,6 +11037,7 @@
               <w:bottom w:val="single" w:color="DDDDDD" w:sz="1"/>
               <w:right w:val="single" w:color="DDDDDD" w:sz="1"/>
             </w:tcBorders>
+            <w:shd w:fill="F0F0F5" w:val="clear"/>
             <w:tcMar>
               <w:top w:type="dxa" w:w="80"/>
               <w:left w:type="dxa" w:w="120"/>
@@ -10811,6 +11066,7 @@
               <w:bottom w:val="single" w:color="DDDDDD" w:sz="1"/>
               <w:right w:val="single" w:color="DDDDDD" w:sz="1"/>
             </w:tcBorders>
+            <w:shd w:fill="F0F0F5" w:val="clear"/>
             <w:tcMar>
               <w:top w:type="dxa" w:w="80"/>
               <w:left w:type="dxa" w:w="120"/>
@@ -10839,6 +11095,7 @@
               <w:bottom w:val="single" w:color="DDDDDD" w:sz="1"/>
               <w:right w:val="single" w:color="DDDDDD" w:sz="1"/>
             </w:tcBorders>
+            <w:shd w:fill="F0F0F5" w:val="clear"/>
             <w:tcMar>
               <w:top w:type="dxa" w:w="80"/>
               <w:left w:type="dxa" w:w="120"/>
@@ -10867,6 +11124,7 @@
               <w:bottom w:val="single" w:color="DDDDDD" w:sz="1"/>
               <w:right w:val="single" w:color="DDDDDD" w:sz="1"/>
             </w:tcBorders>
+            <w:shd w:fill="F0F0F5" w:val="clear"/>
             <w:tcMar>
               <w:top w:type="dxa" w:w="80"/>
               <w:left w:type="dxa" w:w="120"/>
@@ -10897,6 +11155,7 @@
               <w:bottom w:val="single" w:color="DDDDDD" w:sz="1"/>
               <w:right w:val="single" w:color="DDDDDD" w:sz="1"/>
             </w:tcBorders>
+            <w:shd w:fill="FFFFFF" w:val="clear"/>
             <w:tcMar>
               <w:top w:type="dxa" w:w="80"/>
               <w:left w:type="dxa" w:w="120"/>
@@ -10925,6 +11184,7 @@
               <w:bottom w:val="single" w:color="DDDDDD" w:sz="1"/>
               <w:right w:val="single" w:color="DDDDDD" w:sz="1"/>
             </w:tcBorders>
+            <w:shd w:fill="FFFFFF" w:val="clear"/>
             <w:tcMar>
               <w:top w:type="dxa" w:w="80"/>
               <w:left w:type="dxa" w:w="120"/>
@@ -10953,6 +11213,7 @@
               <w:bottom w:val="single" w:color="DDDDDD" w:sz="1"/>
               <w:right w:val="single" w:color="DDDDDD" w:sz="1"/>
             </w:tcBorders>
+            <w:shd w:fill="FFFFFF" w:val="clear"/>
             <w:tcMar>
               <w:top w:type="dxa" w:w="80"/>
               <w:left w:type="dxa" w:w="120"/>
@@ -10981,6 +11242,7 @@
               <w:bottom w:val="single" w:color="DDDDDD" w:sz="1"/>
               <w:right w:val="single" w:color="DDDDDD" w:sz="1"/>
             </w:tcBorders>
+            <w:shd w:fill="FFFFFF" w:val="clear"/>
             <w:tcMar>
               <w:top w:type="dxa" w:w="80"/>
               <w:left w:type="dxa" w:w="120"/>
@@ -11011,6 +11273,7 @@
               <w:bottom w:val="single" w:color="DDDDDD" w:sz="1"/>
               <w:right w:val="single" w:color="DDDDDD" w:sz="1"/>
             </w:tcBorders>
+            <w:shd w:fill="F0F0F5" w:val="clear"/>
             <w:tcMar>
               <w:top w:type="dxa" w:w="80"/>
               <w:left w:type="dxa" w:w="120"/>
@@ -11039,6 +11302,7 @@
               <w:bottom w:val="single" w:color="DDDDDD" w:sz="1"/>
               <w:right w:val="single" w:color="DDDDDD" w:sz="1"/>
             </w:tcBorders>
+            <w:shd w:fill="F0F0F5" w:val="clear"/>
             <w:tcMar>
               <w:top w:type="dxa" w:w="80"/>
               <w:left w:type="dxa" w:w="120"/>
@@ -11067,6 +11331,7 @@
               <w:bottom w:val="single" w:color="DDDDDD" w:sz="1"/>
               <w:right w:val="single" w:color="DDDDDD" w:sz="1"/>
             </w:tcBorders>
+            <w:shd w:fill="F0F0F5" w:val="clear"/>
             <w:tcMar>
               <w:top w:type="dxa" w:w="80"/>
               <w:left w:type="dxa" w:w="120"/>
@@ -11095,6 +11360,7 @@
               <w:bottom w:val="single" w:color="DDDDDD" w:sz="1"/>
               <w:right w:val="single" w:color="DDDDDD" w:sz="1"/>
             </w:tcBorders>
+            <w:shd w:fill="F0F0F5" w:val="clear"/>
             <w:tcMar>
               <w:top w:type="dxa" w:w="80"/>
               <w:left w:type="dxa" w:w="120"/>
@@ -11125,6 +11391,7 @@
               <w:bottom w:val="single" w:color="DDDDDD" w:sz="1"/>
               <w:right w:val="single" w:color="DDDDDD" w:sz="1"/>
             </w:tcBorders>
+            <w:shd w:fill="FFFFFF" w:val="clear"/>
             <w:tcMar>
               <w:top w:type="dxa" w:w="80"/>
               <w:left w:type="dxa" w:w="120"/>
@@ -11153,6 +11420,7 @@
               <w:bottom w:val="single" w:color="DDDDDD" w:sz="1"/>
               <w:right w:val="single" w:color="DDDDDD" w:sz="1"/>
             </w:tcBorders>
+            <w:shd w:fill="FFFFFF" w:val="clear"/>
             <w:tcMar>
               <w:top w:type="dxa" w:w="80"/>
               <w:left w:type="dxa" w:w="120"/>
@@ -11181,6 +11449,7 @@
               <w:bottom w:val="single" w:color="DDDDDD" w:sz="1"/>
               <w:right w:val="single" w:color="DDDDDD" w:sz="1"/>
             </w:tcBorders>
+            <w:shd w:fill="FFFFFF" w:val="clear"/>
             <w:tcMar>
               <w:top w:type="dxa" w:w="80"/>
               <w:left w:type="dxa" w:w="120"/>
@@ -11209,6 +11478,7 @@
               <w:bottom w:val="single" w:color="DDDDDD" w:sz="1"/>
               <w:right w:val="single" w:color="DDDDDD" w:sz="1"/>
             </w:tcBorders>
+            <w:shd w:fill="FFFFFF" w:val="clear"/>
             <w:tcMar>
               <w:top w:type="dxa" w:w="80"/>
               <w:left w:type="dxa" w:w="120"/>
@@ -11396,6 +11666,7 @@
               <w:bottom w:val="single" w:color="DDDDDD" w:sz="1"/>
               <w:right w:val="single" w:color="DDDDDD" w:sz="1"/>
             </w:tcBorders>
+            <w:shd w:fill="FFFFFF" w:val="clear"/>
             <w:tcMar>
               <w:top w:type="dxa" w:w="80"/>
               <w:left w:type="dxa" w:w="120"/>
@@ -11424,6 +11695,7 @@
               <w:bottom w:val="single" w:color="DDDDDD" w:sz="1"/>
               <w:right w:val="single" w:color="DDDDDD" w:sz="1"/>
             </w:tcBorders>
+            <w:shd w:fill="FFFFFF" w:val="clear"/>
             <w:tcMar>
               <w:top w:type="dxa" w:w="80"/>
               <w:left w:type="dxa" w:w="120"/>
@@ -11452,6 +11724,7 @@
               <w:bottom w:val="single" w:color="DDDDDD" w:sz="1"/>
               <w:right w:val="single" w:color="DDDDDD" w:sz="1"/>
             </w:tcBorders>
+            <w:shd w:fill="FFFFFF" w:val="clear"/>
             <w:tcMar>
               <w:top w:type="dxa" w:w="80"/>
               <w:left w:type="dxa" w:w="120"/>
@@ -11482,6 +11755,7 @@
               <w:bottom w:val="single" w:color="DDDDDD" w:sz="1"/>
               <w:right w:val="single" w:color="DDDDDD" w:sz="1"/>
             </w:tcBorders>
+            <w:shd w:fill="F0F0F5" w:val="clear"/>
             <w:tcMar>
               <w:top w:type="dxa" w:w="80"/>
               <w:left w:type="dxa" w:w="120"/>
@@ -11510,6 +11784,7 @@
               <w:bottom w:val="single" w:color="DDDDDD" w:sz="1"/>
               <w:right w:val="single" w:color="DDDDDD" w:sz="1"/>
             </w:tcBorders>
+            <w:shd w:fill="F0F0F5" w:val="clear"/>
             <w:tcMar>
               <w:top w:type="dxa" w:w="80"/>
               <w:left w:type="dxa" w:w="120"/>
@@ -11538,6 +11813,7 @@
               <w:bottom w:val="single" w:color="DDDDDD" w:sz="1"/>
               <w:right w:val="single" w:color="DDDDDD" w:sz="1"/>
             </w:tcBorders>
+            <w:shd w:fill="F0F0F5" w:val="clear"/>
             <w:tcMar>
               <w:top w:type="dxa" w:w="80"/>
               <w:left w:type="dxa" w:w="120"/>
@@ -11568,6 +11844,7 @@
               <w:bottom w:val="single" w:color="DDDDDD" w:sz="1"/>
               <w:right w:val="single" w:color="DDDDDD" w:sz="1"/>
             </w:tcBorders>
+            <w:shd w:fill="FFFFFF" w:val="clear"/>
             <w:tcMar>
               <w:top w:type="dxa" w:w="80"/>
               <w:left w:type="dxa" w:w="120"/>
@@ -11596,6 +11873,7 @@
               <w:bottom w:val="single" w:color="DDDDDD" w:sz="1"/>
               <w:right w:val="single" w:color="DDDDDD" w:sz="1"/>
             </w:tcBorders>
+            <w:shd w:fill="FFFFFF" w:val="clear"/>
             <w:tcMar>
               <w:top w:type="dxa" w:w="80"/>
               <w:left w:type="dxa" w:w="120"/>
@@ -11624,6 +11902,7 @@
               <w:bottom w:val="single" w:color="DDDDDD" w:sz="1"/>
               <w:right w:val="single" w:color="DDDDDD" w:sz="1"/>
             </w:tcBorders>
+            <w:shd w:fill="FFFFFF" w:val="clear"/>
             <w:tcMar>
               <w:top w:type="dxa" w:w="80"/>
               <w:left w:type="dxa" w:w="120"/>
@@ -11654,6 +11933,7 @@
               <w:bottom w:val="single" w:color="DDDDDD" w:sz="1"/>
               <w:right w:val="single" w:color="DDDDDD" w:sz="1"/>
             </w:tcBorders>
+            <w:shd w:fill="F0F0F5" w:val="clear"/>
             <w:tcMar>
               <w:top w:type="dxa" w:w="80"/>
               <w:left w:type="dxa" w:w="120"/>
@@ -11682,6 +11962,7 @@
               <w:bottom w:val="single" w:color="DDDDDD" w:sz="1"/>
               <w:right w:val="single" w:color="DDDDDD" w:sz="1"/>
             </w:tcBorders>
+            <w:shd w:fill="F0F0F5" w:val="clear"/>
             <w:tcMar>
               <w:top w:type="dxa" w:w="80"/>
               <w:left w:type="dxa" w:w="120"/>
@@ -11710,6 +11991,7 @@
               <w:bottom w:val="single" w:color="DDDDDD" w:sz="1"/>
               <w:right w:val="single" w:color="DDDDDD" w:sz="1"/>
             </w:tcBorders>
+            <w:shd w:fill="F0F0F5" w:val="clear"/>
             <w:tcMar>
               <w:top w:type="dxa" w:w="80"/>
               <w:left w:type="dxa" w:w="120"/>
@@ -11740,6 +12022,7 @@
               <w:bottom w:val="single" w:color="DDDDDD" w:sz="1"/>
               <w:right w:val="single" w:color="DDDDDD" w:sz="1"/>
             </w:tcBorders>
+            <w:shd w:fill="FFFFFF" w:val="clear"/>
             <w:tcMar>
               <w:top w:type="dxa" w:w="80"/>
               <w:left w:type="dxa" w:w="120"/>
@@ -11768,6 +12051,7 @@
               <w:bottom w:val="single" w:color="DDDDDD" w:sz="1"/>
               <w:right w:val="single" w:color="DDDDDD" w:sz="1"/>
             </w:tcBorders>
+            <w:shd w:fill="FFFFFF" w:val="clear"/>
             <w:tcMar>
               <w:top w:type="dxa" w:w="80"/>
               <w:left w:type="dxa" w:w="120"/>
@@ -11796,6 +12080,7 @@
               <w:bottom w:val="single" w:color="DDDDDD" w:sz="1"/>
               <w:right w:val="single" w:color="DDDDDD" w:sz="1"/>
             </w:tcBorders>
+            <w:shd w:fill="FFFFFF" w:val="clear"/>
             <w:tcMar>
               <w:top w:type="dxa" w:w="80"/>
               <w:left w:type="dxa" w:w="120"/>
@@ -12184,6 +12469,7 @@
               <w:bottom w:val="single" w:color="DDDDDD" w:sz="1"/>
               <w:right w:val="single" w:color="DDDDDD" w:sz="1"/>
             </w:tcBorders>
+            <w:shd w:fill="FFFFFF" w:val="clear"/>
             <w:tcMar>
               <w:top w:type="dxa" w:w="80"/>
               <w:left w:type="dxa" w:w="120"/>
@@ -12212,6 +12498,7 @@
               <w:bottom w:val="single" w:color="DDDDDD" w:sz="1"/>
               <w:right w:val="single" w:color="DDDDDD" w:sz="1"/>
             </w:tcBorders>
+            <w:shd w:fill="FFFFFF" w:val="clear"/>
             <w:tcMar>
               <w:top w:type="dxa" w:w="80"/>
               <w:left w:type="dxa" w:w="120"/>
@@ -12240,6 +12527,7 @@
               <w:bottom w:val="single" w:color="DDDDDD" w:sz="1"/>
               <w:right w:val="single" w:color="DDDDDD" w:sz="1"/>
             </w:tcBorders>
+            <w:shd w:fill="FFFFFF" w:val="clear"/>
             <w:tcMar>
               <w:top w:type="dxa" w:w="80"/>
               <w:left w:type="dxa" w:w="120"/>
@@ -12268,6 +12556,7 @@
               <w:bottom w:val="single" w:color="DDDDDD" w:sz="1"/>
               <w:right w:val="single" w:color="DDDDDD" w:sz="1"/>
             </w:tcBorders>
+            <w:shd w:fill="FFFFFF" w:val="clear"/>
             <w:tcMar>
               <w:top w:type="dxa" w:w="80"/>
               <w:left w:type="dxa" w:w="120"/>
@@ -12298,6 +12587,7 @@
               <w:bottom w:val="single" w:color="DDDDDD" w:sz="1"/>
               <w:right w:val="single" w:color="DDDDDD" w:sz="1"/>
             </w:tcBorders>
+            <w:shd w:fill="F0F0F5" w:val="clear"/>
             <w:tcMar>
               <w:top w:type="dxa" w:w="80"/>
               <w:left w:type="dxa" w:w="120"/>
@@ -12326,6 +12616,7 @@
               <w:bottom w:val="single" w:color="DDDDDD" w:sz="1"/>
               <w:right w:val="single" w:color="DDDDDD" w:sz="1"/>
             </w:tcBorders>
+            <w:shd w:fill="F0F0F5" w:val="clear"/>
             <w:tcMar>
               <w:top w:type="dxa" w:w="80"/>
               <w:left w:type="dxa" w:w="120"/>
@@ -12354,6 +12645,7 @@
               <w:bottom w:val="single" w:color="DDDDDD" w:sz="1"/>
               <w:right w:val="single" w:color="DDDDDD" w:sz="1"/>
             </w:tcBorders>
+            <w:shd w:fill="F0F0F5" w:val="clear"/>
             <w:tcMar>
               <w:top w:type="dxa" w:w="80"/>
               <w:left w:type="dxa" w:w="120"/>
@@ -12382,6 +12674,7 @@
               <w:bottom w:val="single" w:color="DDDDDD" w:sz="1"/>
               <w:right w:val="single" w:color="DDDDDD" w:sz="1"/>
             </w:tcBorders>
+            <w:shd w:fill="F0F0F5" w:val="clear"/>
             <w:tcMar>
               <w:top w:type="dxa" w:w="80"/>
               <w:left w:type="dxa" w:w="120"/>
@@ -12412,6 +12705,7 @@
               <w:bottom w:val="single" w:color="DDDDDD" w:sz="1"/>
               <w:right w:val="single" w:color="DDDDDD" w:sz="1"/>
             </w:tcBorders>
+            <w:shd w:fill="FFFFFF" w:val="clear"/>
             <w:tcMar>
               <w:top w:type="dxa" w:w="80"/>
               <w:left w:type="dxa" w:w="120"/>
@@ -12440,6 +12734,7 @@
               <w:bottom w:val="single" w:color="DDDDDD" w:sz="1"/>
               <w:right w:val="single" w:color="DDDDDD" w:sz="1"/>
             </w:tcBorders>
+            <w:shd w:fill="FFFFFF" w:val="clear"/>
             <w:tcMar>
               <w:top w:type="dxa" w:w="80"/>
               <w:left w:type="dxa" w:w="120"/>
@@ -12468,6 +12763,7 @@
               <w:bottom w:val="single" w:color="DDDDDD" w:sz="1"/>
               <w:right w:val="single" w:color="DDDDDD" w:sz="1"/>
             </w:tcBorders>
+            <w:shd w:fill="FFFFFF" w:val="clear"/>
             <w:tcMar>
               <w:top w:type="dxa" w:w="80"/>
               <w:left w:type="dxa" w:w="120"/>
@@ -12496,6 +12792,7 @@
               <w:bottom w:val="single" w:color="DDDDDD" w:sz="1"/>
               <w:right w:val="single" w:color="DDDDDD" w:sz="1"/>
             </w:tcBorders>
+            <w:shd w:fill="FFFFFF" w:val="clear"/>
             <w:tcMar>
               <w:top w:type="dxa" w:w="80"/>
               <w:left w:type="dxa" w:w="120"/>
@@ -12526,6 +12823,7 @@
               <w:bottom w:val="single" w:color="DDDDDD" w:sz="1"/>
               <w:right w:val="single" w:color="DDDDDD" w:sz="1"/>
             </w:tcBorders>
+            <w:shd w:fill="F0F0F5" w:val="clear"/>
             <w:tcMar>
               <w:top w:type="dxa" w:w="80"/>
               <w:left w:type="dxa" w:w="120"/>
@@ -12554,6 +12852,7 @@
               <w:bottom w:val="single" w:color="DDDDDD" w:sz="1"/>
               <w:right w:val="single" w:color="DDDDDD" w:sz="1"/>
             </w:tcBorders>
+            <w:shd w:fill="F0F0F5" w:val="clear"/>
             <w:tcMar>
               <w:top w:type="dxa" w:w="80"/>
               <w:left w:type="dxa" w:w="120"/>
@@ -12582,6 +12881,7 @@
               <w:bottom w:val="single" w:color="DDDDDD" w:sz="1"/>
               <w:right w:val="single" w:color="DDDDDD" w:sz="1"/>
             </w:tcBorders>
+            <w:shd w:fill="F0F0F5" w:val="clear"/>
             <w:tcMar>
               <w:top w:type="dxa" w:w="80"/>
               <w:left w:type="dxa" w:w="120"/>
@@ -12610,6 +12910,7 @@
               <w:bottom w:val="single" w:color="DDDDDD" w:sz="1"/>
               <w:right w:val="single" w:color="DDDDDD" w:sz="1"/>
             </w:tcBorders>
+            <w:shd w:fill="F0F0F5" w:val="clear"/>
             <w:tcMar>
               <w:top w:type="dxa" w:w="80"/>
               <w:left w:type="dxa" w:w="120"/>
@@ -12807,6 +13108,7 @@
               <w:bottom w:val="single" w:color="DDDDDD" w:sz="1"/>
               <w:right w:val="single" w:color="DDDDDD" w:sz="1"/>
             </w:tcBorders>
+            <w:shd w:fill="FFFFFF" w:val="clear"/>
             <w:tcMar>
               <w:top w:type="dxa" w:w="80"/>
               <w:left w:type="dxa" w:w="120"/>
@@ -12835,6 +13137,7 @@
               <w:bottom w:val="single" w:color="DDDDDD" w:sz="1"/>
               <w:right w:val="single" w:color="DDDDDD" w:sz="1"/>
             </w:tcBorders>
+            <w:shd w:fill="FFFFFF" w:val="clear"/>
             <w:tcMar>
               <w:top w:type="dxa" w:w="80"/>
               <w:left w:type="dxa" w:w="120"/>
@@ -12863,6 +13166,7 @@
               <w:bottom w:val="single" w:color="DDDDDD" w:sz="1"/>
               <w:right w:val="single" w:color="DDDDDD" w:sz="1"/>
             </w:tcBorders>
+            <w:shd w:fill="FFFFFF" w:val="clear"/>
             <w:tcMar>
               <w:top w:type="dxa" w:w="80"/>
               <w:left w:type="dxa" w:w="120"/>
@@ -12891,6 +13195,7 @@
               <w:bottom w:val="single" w:color="DDDDDD" w:sz="1"/>
               <w:right w:val="single" w:color="DDDDDD" w:sz="1"/>
             </w:tcBorders>
+            <w:shd w:fill="FFFFFF" w:val="clear"/>
             <w:tcMar>
               <w:top w:type="dxa" w:w="80"/>
               <w:left w:type="dxa" w:w="120"/>
@@ -12921,6 +13226,7 @@
               <w:bottom w:val="single" w:color="DDDDDD" w:sz="1"/>
               <w:right w:val="single" w:color="DDDDDD" w:sz="1"/>
             </w:tcBorders>
+            <w:shd w:fill="F0F0F5" w:val="clear"/>
             <w:tcMar>
               <w:top w:type="dxa" w:w="80"/>
               <w:left w:type="dxa" w:w="120"/>
@@ -12949,6 +13255,7 @@
               <w:bottom w:val="single" w:color="DDDDDD" w:sz="1"/>
               <w:right w:val="single" w:color="DDDDDD" w:sz="1"/>
             </w:tcBorders>
+            <w:shd w:fill="F0F0F5" w:val="clear"/>
             <w:tcMar>
               <w:top w:type="dxa" w:w="80"/>
               <w:left w:type="dxa" w:w="120"/>
@@ -12977,6 +13284,7 @@
               <w:bottom w:val="single" w:color="DDDDDD" w:sz="1"/>
               <w:right w:val="single" w:color="DDDDDD" w:sz="1"/>
             </w:tcBorders>
+            <w:shd w:fill="F0F0F5" w:val="clear"/>
             <w:tcMar>
               <w:top w:type="dxa" w:w="80"/>
               <w:left w:type="dxa" w:w="120"/>
@@ -13005,6 +13313,7 @@
               <w:bottom w:val="single" w:color="DDDDDD" w:sz="1"/>
               <w:right w:val="single" w:color="DDDDDD" w:sz="1"/>
             </w:tcBorders>
+            <w:shd w:fill="F0F0F5" w:val="clear"/>
             <w:tcMar>
               <w:top w:type="dxa" w:w="80"/>
               <w:left w:type="dxa" w:w="120"/>
@@ -13035,6 +13344,7 @@
               <w:bottom w:val="single" w:color="DDDDDD" w:sz="1"/>
               <w:right w:val="single" w:color="DDDDDD" w:sz="1"/>
             </w:tcBorders>
+            <w:shd w:fill="FFFFFF" w:val="clear"/>
             <w:tcMar>
               <w:top w:type="dxa" w:w="80"/>
               <w:left w:type="dxa" w:w="120"/>
@@ -13063,6 +13373,7 @@
               <w:bottom w:val="single" w:color="DDDDDD" w:sz="1"/>
               <w:right w:val="single" w:color="DDDDDD" w:sz="1"/>
             </w:tcBorders>
+            <w:shd w:fill="FFFFFF" w:val="clear"/>
             <w:tcMar>
               <w:top w:type="dxa" w:w="80"/>
               <w:left w:type="dxa" w:w="120"/>
@@ -13091,6 +13402,7 @@
               <w:bottom w:val="single" w:color="DDDDDD" w:sz="1"/>
               <w:right w:val="single" w:color="DDDDDD" w:sz="1"/>
             </w:tcBorders>
+            <w:shd w:fill="FFFFFF" w:val="clear"/>
             <w:tcMar>
               <w:top w:type="dxa" w:w="80"/>
               <w:left w:type="dxa" w:w="120"/>
@@ -13119,6 +13431,7 @@
               <w:bottom w:val="single" w:color="DDDDDD" w:sz="1"/>
               <w:right w:val="single" w:color="DDDDDD" w:sz="1"/>
             </w:tcBorders>
+            <w:shd w:fill="FFFFFF" w:val="clear"/>
             <w:tcMar>
               <w:top w:type="dxa" w:w="80"/>
               <w:left w:type="dxa" w:w="120"/>
@@ -13149,6 +13462,7 @@
               <w:bottom w:val="single" w:color="DDDDDD" w:sz="1"/>
               <w:right w:val="single" w:color="DDDDDD" w:sz="1"/>
             </w:tcBorders>
+            <w:shd w:fill="F0F0F5" w:val="clear"/>
             <w:tcMar>
               <w:top w:type="dxa" w:w="80"/>
               <w:left w:type="dxa" w:w="120"/>
@@ -13177,6 +13491,7 @@
               <w:bottom w:val="single" w:color="DDDDDD" w:sz="1"/>
               <w:right w:val="single" w:color="DDDDDD" w:sz="1"/>
             </w:tcBorders>
+            <w:shd w:fill="F0F0F5" w:val="clear"/>
             <w:tcMar>
               <w:top w:type="dxa" w:w="80"/>
               <w:left w:type="dxa" w:w="120"/>
@@ -13205,6 +13520,7 @@
               <w:bottom w:val="single" w:color="DDDDDD" w:sz="1"/>
               <w:right w:val="single" w:color="DDDDDD" w:sz="1"/>
             </w:tcBorders>
+            <w:shd w:fill="F0F0F5" w:val="clear"/>
             <w:tcMar>
               <w:top w:type="dxa" w:w="80"/>
               <w:left w:type="dxa" w:w="120"/>
@@ -13233,6 +13549,7 @@
               <w:bottom w:val="single" w:color="DDDDDD" w:sz="1"/>
               <w:right w:val="single" w:color="DDDDDD" w:sz="1"/>
             </w:tcBorders>
+            <w:shd w:fill="F0F0F5" w:val="clear"/>
             <w:tcMar>
               <w:top w:type="dxa" w:w="80"/>
               <w:left w:type="dxa" w:w="120"/>
@@ -13430,6 +13747,7 @@
               <w:bottom w:val="single" w:color="DDDDDD" w:sz="1"/>
               <w:right w:val="single" w:color="DDDDDD" w:sz="1"/>
             </w:tcBorders>
+            <w:shd w:fill="FFFFFF" w:val="clear"/>
             <w:tcMar>
               <w:top w:type="dxa" w:w="80"/>
               <w:left w:type="dxa" w:w="120"/>
@@ -13458,6 +13776,7 @@
               <w:bottom w:val="single" w:color="DDDDDD" w:sz="1"/>
               <w:right w:val="single" w:color="DDDDDD" w:sz="1"/>
             </w:tcBorders>
+            <w:shd w:fill="FFFFFF" w:val="clear"/>
             <w:tcMar>
               <w:top w:type="dxa" w:w="80"/>
               <w:left w:type="dxa" w:w="120"/>
@@ -13486,6 +13805,7 @@
               <w:bottom w:val="single" w:color="DDDDDD" w:sz="1"/>
               <w:right w:val="single" w:color="DDDDDD" w:sz="1"/>
             </w:tcBorders>
+            <w:shd w:fill="FFFFFF" w:val="clear"/>
             <w:tcMar>
               <w:top w:type="dxa" w:w="80"/>
               <w:left w:type="dxa" w:w="120"/>
@@ -13514,6 +13834,7 @@
               <w:bottom w:val="single" w:color="DDDDDD" w:sz="1"/>
               <w:right w:val="single" w:color="DDDDDD" w:sz="1"/>
             </w:tcBorders>
+            <w:shd w:fill="FFFFFF" w:val="clear"/>
             <w:tcMar>
               <w:top w:type="dxa" w:w="80"/>
               <w:left w:type="dxa" w:w="120"/>
@@ -13544,6 +13865,7 @@
               <w:bottom w:val="single" w:color="DDDDDD" w:sz="1"/>
               <w:right w:val="single" w:color="DDDDDD" w:sz="1"/>
             </w:tcBorders>
+            <w:shd w:fill="F0F0F5" w:val="clear"/>
             <w:tcMar>
               <w:top w:type="dxa" w:w="80"/>
               <w:left w:type="dxa" w:w="120"/>
@@ -13572,6 +13894,7 @@
               <w:bottom w:val="single" w:color="DDDDDD" w:sz="1"/>
               <w:right w:val="single" w:color="DDDDDD" w:sz="1"/>
             </w:tcBorders>
+            <w:shd w:fill="F0F0F5" w:val="clear"/>
             <w:tcMar>
               <w:top w:type="dxa" w:w="80"/>
               <w:left w:type="dxa" w:w="120"/>
@@ -13600,6 +13923,7 @@
               <w:bottom w:val="single" w:color="DDDDDD" w:sz="1"/>
               <w:right w:val="single" w:color="DDDDDD" w:sz="1"/>
             </w:tcBorders>
+            <w:shd w:fill="F0F0F5" w:val="clear"/>
             <w:tcMar>
               <w:top w:type="dxa" w:w="80"/>
               <w:left w:type="dxa" w:w="120"/>
@@ -13628,6 +13952,7 @@
               <w:bottom w:val="single" w:color="DDDDDD" w:sz="1"/>
               <w:right w:val="single" w:color="DDDDDD" w:sz="1"/>
             </w:tcBorders>
+            <w:shd w:fill="F0F0F5" w:val="clear"/>
             <w:tcMar>
               <w:top w:type="dxa" w:w="80"/>
               <w:left w:type="dxa" w:w="120"/>
@@ -13658,6 +13983,7 @@
               <w:bottom w:val="single" w:color="DDDDDD" w:sz="1"/>
               <w:right w:val="single" w:color="DDDDDD" w:sz="1"/>
             </w:tcBorders>
+            <w:shd w:fill="FFFFFF" w:val="clear"/>
             <w:tcMar>
               <w:top w:type="dxa" w:w="80"/>
               <w:left w:type="dxa" w:w="120"/>
@@ -13686,6 +14012,7 @@
               <w:bottom w:val="single" w:color="DDDDDD" w:sz="1"/>
               <w:right w:val="single" w:color="DDDDDD" w:sz="1"/>
             </w:tcBorders>
+            <w:shd w:fill="FFFFFF" w:val="clear"/>
             <w:tcMar>
               <w:top w:type="dxa" w:w="80"/>
               <w:left w:type="dxa" w:w="120"/>
@@ -13714,6 +14041,7 @@
               <w:bottom w:val="single" w:color="DDDDDD" w:sz="1"/>
               <w:right w:val="single" w:color="DDDDDD" w:sz="1"/>
             </w:tcBorders>
+            <w:shd w:fill="FFFFFF" w:val="clear"/>
             <w:tcMar>
               <w:top w:type="dxa" w:w="80"/>
               <w:left w:type="dxa" w:w="120"/>
@@ -13742,6 +14070,7 @@
               <w:bottom w:val="single" w:color="DDDDDD" w:sz="1"/>
               <w:right w:val="single" w:color="DDDDDD" w:sz="1"/>
             </w:tcBorders>
+            <w:shd w:fill="FFFFFF" w:val="clear"/>
             <w:tcMar>
               <w:top w:type="dxa" w:w="80"/>
               <w:left w:type="dxa" w:w="120"/>
@@ -13772,6 +14101,7 @@
               <w:bottom w:val="single" w:color="DDDDDD" w:sz="1"/>
               <w:right w:val="single" w:color="DDDDDD" w:sz="1"/>
             </w:tcBorders>
+            <w:shd w:fill="F0F0F5" w:val="clear"/>
             <w:tcMar>
               <w:top w:type="dxa" w:w="80"/>
               <w:left w:type="dxa" w:w="120"/>
@@ -13800,6 +14130,7 @@
               <w:bottom w:val="single" w:color="DDDDDD" w:sz="1"/>
               <w:right w:val="single" w:color="DDDDDD" w:sz="1"/>
             </w:tcBorders>
+            <w:shd w:fill="F0F0F5" w:val="clear"/>
             <w:tcMar>
               <w:top w:type="dxa" w:w="80"/>
               <w:left w:type="dxa" w:w="120"/>
@@ -13828,6 +14159,7 @@
               <w:bottom w:val="single" w:color="DDDDDD" w:sz="1"/>
               <w:right w:val="single" w:color="DDDDDD" w:sz="1"/>
             </w:tcBorders>
+            <w:shd w:fill="F0F0F5" w:val="clear"/>
             <w:tcMar>
               <w:top w:type="dxa" w:w="80"/>
               <w:left w:type="dxa" w:w="120"/>
@@ -13856,6 +14188,7 @@
               <w:bottom w:val="single" w:color="DDDDDD" w:sz="1"/>
               <w:right w:val="single" w:color="DDDDDD" w:sz="1"/>
             </w:tcBorders>
+            <w:shd w:fill="F0F0F5" w:val="clear"/>
             <w:tcMar>
               <w:top w:type="dxa" w:w="80"/>
               <w:left w:type="dxa" w:w="120"/>
@@ -14109,6 +14442,7 @@
               <w:bottom w:val="single" w:color="DDDDDD" w:sz="1"/>
               <w:right w:val="single" w:color="DDDDDD" w:sz="1"/>
             </w:tcBorders>
+            <w:shd w:fill="FFFFFF" w:val="clear"/>
             <w:tcMar>
               <w:top w:type="dxa" w:w="80"/>
               <w:left w:type="dxa" w:w="120"/>
@@ -14137,6 +14471,7 @@
               <w:bottom w:val="single" w:color="DDDDDD" w:sz="1"/>
               <w:right w:val="single" w:color="DDDDDD" w:sz="1"/>
             </w:tcBorders>
+            <w:shd w:fill="FFFFFF" w:val="clear"/>
             <w:tcMar>
               <w:top w:type="dxa" w:w="80"/>
               <w:left w:type="dxa" w:w="120"/>
@@ -14165,6 +14500,7 @@
               <w:bottom w:val="single" w:color="DDDDDD" w:sz="1"/>
               <w:right w:val="single" w:color="DDDDDD" w:sz="1"/>
             </w:tcBorders>
+            <w:shd w:fill="FFFFFF" w:val="clear"/>
             <w:tcMar>
               <w:top w:type="dxa" w:w="80"/>
               <w:left w:type="dxa" w:w="120"/>
@@ -14195,6 +14531,7 @@
               <w:bottom w:val="single" w:color="DDDDDD" w:sz="1"/>
               <w:right w:val="single" w:color="DDDDDD" w:sz="1"/>
             </w:tcBorders>
+            <w:shd w:fill="F0F0F5" w:val="clear"/>
             <w:tcMar>
               <w:top w:type="dxa" w:w="80"/>
               <w:left w:type="dxa" w:w="120"/>
@@ -14223,6 +14560,7 @@
               <w:bottom w:val="single" w:color="DDDDDD" w:sz="1"/>
               <w:right w:val="single" w:color="DDDDDD" w:sz="1"/>
             </w:tcBorders>
+            <w:shd w:fill="F0F0F5" w:val="clear"/>
             <w:tcMar>
               <w:top w:type="dxa" w:w="80"/>
               <w:left w:type="dxa" w:w="120"/>
@@ -14251,6 +14589,7 @@
               <w:bottom w:val="single" w:color="DDDDDD" w:sz="1"/>
               <w:right w:val="single" w:color="DDDDDD" w:sz="1"/>
             </w:tcBorders>
+            <w:shd w:fill="F0F0F5" w:val="clear"/>
             <w:tcMar>
               <w:top w:type="dxa" w:w="80"/>
               <w:left w:type="dxa" w:w="120"/>
@@ -14281,6 +14620,7 @@
               <w:bottom w:val="single" w:color="DDDDDD" w:sz="1"/>
               <w:right w:val="single" w:color="DDDDDD" w:sz="1"/>
             </w:tcBorders>
+            <w:shd w:fill="FFFFFF" w:val="clear"/>
             <w:tcMar>
               <w:top w:type="dxa" w:w="80"/>
               <w:left w:type="dxa" w:w="120"/>
@@ -14309,6 +14649,7 @@
               <w:bottom w:val="single" w:color="DDDDDD" w:sz="1"/>
               <w:right w:val="single" w:color="DDDDDD" w:sz="1"/>
             </w:tcBorders>
+            <w:shd w:fill="FFFFFF" w:val="clear"/>
             <w:tcMar>
               <w:top w:type="dxa" w:w="80"/>
               <w:left w:type="dxa" w:w="120"/>
@@ -14337,6 +14678,7 @@
               <w:bottom w:val="single" w:color="DDDDDD" w:sz="1"/>
               <w:right w:val="single" w:color="DDDDDD" w:sz="1"/>
             </w:tcBorders>
+            <w:shd w:fill="FFFFFF" w:val="clear"/>
             <w:tcMar>
               <w:top w:type="dxa" w:w="80"/>
               <w:left w:type="dxa" w:w="120"/>
@@ -14367,6 +14709,7 @@
               <w:bottom w:val="single" w:color="DDDDDD" w:sz="1"/>
               <w:right w:val="single" w:color="DDDDDD" w:sz="1"/>
             </w:tcBorders>
+            <w:shd w:fill="F0F0F5" w:val="clear"/>
             <w:tcMar>
               <w:top w:type="dxa" w:w="80"/>
               <w:left w:type="dxa" w:w="120"/>
@@ -14395,6 +14738,7 @@
               <w:bottom w:val="single" w:color="DDDDDD" w:sz="1"/>
               <w:right w:val="single" w:color="DDDDDD" w:sz="1"/>
             </w:tcBorders>
+            <w:shd w:fill="F0F0F5" w:val="clear"/>
             <w:tcMar>
               <w:top w:type="dxa" w:w="80"/>
               <w:left w:type="dxa" w:w="120"/>
@@ -14423,6 +14767,7 @@
               <w:bottom w:val="single" w:color="DDDDDD" w:sz="1"/>
               <w:right w:val="single" w:color="DDDDDD" w:sz="1"/>
             </w:tcBorders>
+            <w:shd w:fill="F0F0F5" w:val="clear"/>
             <w:tcMar>
               <w:top w:type="dxa" w:w="80"/>
               <w:left w:type="dxa" w:w="120"/>
@@ -14453,6 +14798,7 @@
               <w:bottom w:val="single" w:color="DDDDDD" w:sz="1"/>
               <w:right w:val="single" w:color="DDDDDD" w:sz="1"/>
             </w:tcBorders>
+            <w:shd w:fill="FFFFFF" w:val="clear"/>
             <w:tcMar>
               <w:top w:type="dxa" w:w="80"/>
               <w:left w:type="dxa" w:w="120"/>
@@ -14481,6 +14827,7 @@
               <w:bottom w:val="single" w:color="DDDDDD" w:sz="1"/>
               <w:right w:val="single" w:color="DDDDDD" w:sz="1"/>
             </w:tcBorders>
+            <w:shd w:fill="FFFFFF" w:val="clear"/>
             <w:tcMar>
               <w:top w:type="dxa" w:w="80"/>
               <w:left w:type="dxa" w:w="120"/>
@@ -14509,6 +14856,7 @@
               <w:bottom w:val="single" w:color="DDDDDD" w:sz="1"/>
               <w:right w:val="single" w:color="DDDDDD" w:sz="1"/>
             </w:tcBorders>
+            <w:shd w:fill="FFFFFF" w:val="clear"/>
             <w:tcMar>
               <w:top w:type="dxa" w:w="80"/>
               <w:left w:type="dxa" w:w="120"/>
@@ -14728,6 +15076,7 @@
               <w:bottom w:val="single" w:color="DDDDDD" w:sz="1"/>
               <w:right w:val="single" w:color="DDDDDD" w:sz="1"/>
             </w:tcBorders>
+            <w:shd w:fill="FFFFFF" w:val="clear"/>
             <w:tcMar>
               <w:top w:type="dxa" w:w="80"/>
               <w:left w:type="dxa" w:w="120"/>
@@ -14756,6 +15105,7 @@
               <w:bottom w:val="single" w:color="DDDDDD" w:sz="1"/>
               <w:right w:val="single" w:color="DDDDDD" w:sz="1"/>
             </w:tcBorders>
+            <w:shd w:fill="FFFFFF" w:val="clear"/>
             <w:tcMar>
               <w:top w:type="dxa" w:w="80"/>
               <w:left w:type="dxa" w:w="120"/>
@@ -14784,6 +15134,7 @@
               <w:bottom w:val="single" w:color="DDDDDD" w:sz="1"/>
               <w:right w:val="single" w:color="DDDDDD" w:sz="1"/>
             </w:tcBorders>
+            <w:shd w:fill="FFFFFF" w:val="clear"/>
             <w:tcMar>
               <w:top w:type="dxa" w:w="80"/>
               <w:left w:type="dxa" w:w="120"/>
@@ -14812,6 +15163,7 @@
               <w:bottom w:val="single" w:color="DDDDDD" w:sz="1"/>
               <w:right w:val="single" w:color="DDDDDD" w:sz="1"/>
             </w:tcBorders>
+            <w:shd w:fill="FFFFFF" w:val="clear"/>
             <w:tcMar>
               <w:top w:type="dxa" w:w="80"/>
               <w:left w:type="dxa" w:w="120"/>
@@ -14842,6 +15194,7 @@
               <w:bottom w:val="single" w:color="DDDDDD" w:sz="1"/>
               <w:right w:val="single" w:color="DDDDDD" w:sz="1"/>
             </w:tcBorders>
+            <w:shd w:fill="F0F0F5" w:val="clear"/>
             <w:tcMar>
               <w:top w:type="dxa" w:w="80"/>
               <w:left w:type="dxa" w:w="120"/>
@@ -14870,6 +15223,7 @@
               <w:bottom w:val="single" w:color="DDDDDD" w:sz="1"/>
               <w:right w:val="single" w:color="DDDDDD" w:sz="1"/>
             </w:tcBorders>
+            <w:shd w:fill="F0F0F5" w:val="clear"/>
             <w:tcMar>
               <w:top w:type="dxa" w:w="80"/>
               <w:left w:type="dxa" w:w="120"/>
@@ -14898,6 +15252,7 @@
               <w:bottom w:val="single" w:color="DDDDDD" w:sz="1"/>
               <w:right w:val="single" w:color="DDDDDD" w:sz="1"/>
             </w:tcBorders>
+            <w:shd w:fill="F0F0F5" w:val="clear"/>
             <w:tcMar>
               <w:top w:type="dxa" w:w="80"/>
               <w:left w:type="dxa" w:w="120"/>
@@ -14926,6 +15281,7 @@
               <w:bottom w:val="single" w:color="DDDDDD" w:sz="1"/>
               <w:right w:val="single" w:color="DDDDDD" w:sz="1"/>
             </w:tcBorders>
+            <w:shd w:fill="F0F0F5" w:val="clear"/>
             <w:tcMar>
               <w:top w:type="dxa" w:w="80"/>
               <w:left w:type="dxa" w:w="120"/>
@@ -14956,6 +15312,7 @@
               <w:bottom w:val="single" w:color="DDDDDD" w:sz="1"/>
               <w:right w:val="single" w:color="DDDDDD" w:sz="1"/>
             </w:tcBorders>
+            <w:shd w:fill="FFFFFF" w:val="clear"/>
             <w:tcMar>
               <w:top w:type="dxa" w:w="80"/>
               <w:left w:type="dxa" w:w="120"/>
@@ -14984,6 +15341,7 @@
               <w:bottom w:val="single" w:color="DDDDDD" w:sz="1"/>
               <w:right w:val="single" w:color="DDDDDD" w:sz="1"/>
             </w:tcBorders>
+            <w:shd w:fill="FFFFFF" w:val="clear"/>
             <w:tcMar>
               <w:top w:type="dxa" w:w="80"/>
               <w:left w:type="dxa" w:w="120"/>
@@ -15012,6 +15370,7 @@
               <w:bottom w:val="single" w:color="DDDDDD" w:sz="1"/>
               <w:right w:val="single" w:color="DDDDDD" w:sz="1"/>
             </w:tcBorders>
+            <w:shd w:fill="FFFFFF" w:val="clear"/>
             <w:tcMar>
               <w:top w:type="dxa" w:w="80"/>
               <w:left w:type="dxa" w:w="120"/>
@@ -15040,6 +15399,7 @@
               <w:bottom w:val="single" w:color="DDDDDD" w:sz="1"/>
               <w:right w:val="single" w:color="DDDDDD" w:sz="1"/>
             </w:tcBorders>
+            <w:shd w:fill="FFFFFF" w:val="clear"/>
             <w:tcMar>
               <w:top w:type="dxa" w:w="80"/>
               <w:left w:type="dxa" w:w="120"/>
@@ -15070,6 +15430,7 @@
               <w:bottom w:val="single" w:color="DDDDDD" w:sz="1"/>
               <w:right w:val="single" w:color="DDDDDD" w:sz="1"/>
             </w:tcBorders>
+            <w:shd w:fill="F0F0F5" w:val="clear"/>
             <w:tcMar>
               <w:top w:type="dxa" w:w="80"/>
               <w:left w:type="dxa" w:w="120"/>
@@ -15098,6 +15459,7 @@
               <w:bottom w:val="single" w:color="DDDDDD" w:sz="1"/>
               <w:right w:val="single" w:color="DDDDDD" w:sz="1"/>
             </w:tcBorders>
+            <w:shd w:fill="F0F0F5" w:val="clear"/>
             <w:tcMar>
               <w:top w:type="dxa" w:w="80"/>
               <w:left w:type="dxa" w:w="120"/>
@@ -15126,6 +15488,7 @@
               <w:bottom w:val="single" w:color="DDDDDD" w:sz="1"/>
               <w:right w:val="single" w:color="DDDDDD" w:sz="1"/>
             </w:tcBorders>
+            <w:shd w:fill="F0F0F5" w:val="clear"/>
             <w:tcMar>
               <w:top w:type="dxa" w:w="80"/>
               <w:left w:type="dxa" w:w="120"/>
@@ -15154,6 +15517,7 @@
               <w:bottom w:val="single" w:color="DDDDDD" w:sz="1"/>
               <w:right w:val="single" w:color="DDDDDD" w:sz="1"/>
             </w:tcBorders>
+            <w:shd w:fill="F0F0F5" w:val="clear"/>
             <w:tcMar>
               <w:top w:type="dxa" w:w="80"/>
               <w:left w:type="dxa" w:w="120"/>
@@ -15331,7 +15695,7 @@
         <w:sz w:val="16"/>
         <w:szCs w:val="16"/>
       </w:rPr>
-      <w:t xml:space="preserve">Page </w:t>
+      <w:t xml:space="preserve">Confidential  |  Page </w:t>
     </w:r>
     <w:r>
       <w:rPr>
@@ -15395,13 +15759,22 @@
     <w:r>
       <w:rPr>
         <w:rFonts w:ascii="Arial" w:cs="Arial" w:eastAsia="Arial" w:hAnsi="Arial"/>
-        <w:i/>
-        <w:iCs/>
+        <w:b/>
+        <w:bCs/>
+        <w:color w:val="6C3CE1"/>
+        <w:sz w:val="16"/>
+        <w:szCs w:val="16"/>
+      </w:rPr>
+      <w:t xml:space="preserve">SYNTHIA</w:t>
+    </w:r>
+    <w:r>
+      <w:rPr>
+        <w:rFonts w:ascii="Arial" w:cs="Arial" w:eastAsia="Arial" w:hAnsi="Arial"/>
         <w:color w:val="555555"/>
         <w:sz w:val="16"/>
         <w:szCs w:val="16"/>
       </w:rPr>
-      <w:t xml:space="preserve">SYNTHIA — CONFIDENTIAL</w:t>
+      <w:t xml:space="preserve">  |  Persona Design v1.0</w:t>
     </w:r>
   </w:p>
 </w:hdr>

</xml_diff>